<commit_message>
chore: update 자체점검표/중간점검표 template files
기존 데이터가 포함된 양식을 빈 양식 템플릿으로 교체.
자체점검표 UL-QP-18-05(01), 중간점검표 UL-QP-18-03(02).

Co-Authored-By: Claude <noreply@anthropic.com>
</commit_message>
<xml_diff>
--- a/docs/procedure/template/UL-QP-18-03(02) 중간점검표.docx
+++ b/docs/procedure/template/UL-QP-18-03(02) 중간점검표.docx
@@ -51,7 +51,7 @@
               <w:spacing w:line="240" w:lineRule="exact"/>
               <w:jc w:val="center"/>
               <w:rPr>
-                <w:rFonts w:ascii="굴림체" w:eastAsia="굴림체" w:hAnsi="굴림체"/>
+                <w:rFonts w:ascii="GulimChe" w:eastAsia="GulimChe" w:hAnsi="GulimChe"/>
                 <w:b/>
                 <w:bCs/>
                 <w:sz w:val="22"/>
@@ -62,7 +62,7 @@
             <w:bookmarkEnd w:id="0"/>
             <w:r>
               <w:rPr>
-                <w:rFonts w:ascii="굴림체" w:eastAsia="굴림체" w:hAnsi="굴림체" w:hint="eastAsia"/>
+                <w:rFonts w:ascii="GulimChe" w:eastAsia="GulimChe" w:hAnsi="GulimChe" w:hint="eastAsia"/>
                 <w:b/>
                 <w:bCs/>
                 <w:sz w:val="22"/>
@@ -89,19 +89,11 @@
               <w:spacing w:line="240" w:lineRule="exact"/>
               <w:jc w:val="center"/>
               <w:rPr>
-                <w:rFonts w:ascii="굴림체" w:eastAsia="굴림체" w:hAnsi="굴림체"/>
-                <w:sz w:val="22"/>
-                <w:szCs w:val="22"/>
-              </w:rPr>
-            </w:pPr>
-            <w:r>
-              <w:rPr>
-                <w:rFonts w:ascii="굴림체" w:eastAsia="굴림체" w:hAnsi="굴림체" w:hint="eastAsia"/>
-                <w:sz w:val="22"/>
-                <w:szCs w:val="22"/>
-              </w:rPr>
-              <w:t>교정기기</w:t>
-            </w:r>
+                <w:rFonts w:ascii="GulimChe" w:eastAsia="GulimChe" w:hAnsi="GulimChe"/>
+                <w:sz w:val="22"/>
+                <w:szCs w:val="22"/>
+              </w:rPr>
+            </w:pPr>
           </w:p>
         </w:tc>
         <w:tc>
@@ -121,7 +113,7 @@
               <w:spacing w:line="240" w:lineRule="exact"/>
               <w:jc w:val="center"/>
               <w:rPr>
-                <w:rFonts w:ascii="굴림체" w:eastAsia="굴림체" w:hAnsi="굴림체"/>
+                <w:rFonts w:ascii="GulimChe" w:eastAsia="GulimChe" w:hAnsi="GulimChe"/>
                 <w:b/>
                 <w:bCs/>
                 <w:sz w:val="22"/>
@@ -130,7 +122,7 @@
             </w:pPr>
             <w:r>
               <w:rPr>
-                <w:rFonts w:ascii="굴림체" w:eastAsia="굴림체" w:hAnsi="굴림체" w:hint="eastAsia"/>
+                <w:rFonts w:ascii="GulimChe" w:eastAsia="GulimChe" w:hAnsi="GulimChe" w:hint="eastAsia"/>
                 <w:b/>
                 <w:bCs/>
                 <w:sz w:val="22"/>
@@ -156,19 +148,11 @@
               <w:spacing w:line="240" w:lineRule="exact"/>
               <w:jc w:val="center"/>
               <w:rPr>
-                <w:rFonts w:ascii="굴림체" w:eastAsia="굴림체" w:hAnsi="굴림체"/>
-                <w:sz w:val="22"/>
-                <w:szCs w:val="22"/>
-              </w:rPr>
-            </w:pPr>
-            <w:r>
-              <w:rPr>
-                <w:rFonts w:ascii="굴림체" w:eastAsia="굴림체" w:hAnsi="굴림체"/>
-                <w:sz w:val="22"/>
-                <w:szCs w:val="22"/>
-              </w:rPr>
-              <w:t>RF</w:t>
-            </w:r>
+                <w:rFonts w:ascii="GulimChe" w:eastAsia="GulimChe" w:hAnsi="GulimChe"/>
+                <w:sz w:val="22"/>
+                <w:szCs w:val="22"/>
+              </w:rPr>
+            </w:pPr>
           </w:p>
         </w:tc>
       </w:tr>
@@ -194,7 +178,7 @@
               <w:spacing w:line="240" w:lineRule="exact"/>
               <w:jc w:val="center"/>
               <w:rPr>
-                <w:rFonts w:ascii="굴림체" w:eastAsia="굴림체" w:hAnsi="굴림체"/>
+                <w:rFonts w:ascii="GulimChe" w:eastAsia="GulimChe" w:hAnsi="GulimChe"/>
                 <w:b/>
                 <w:bCs/>
                 <w:sz w:val="22"/>
@@ -203,7 +187,7 @@
             </w:pPr>
             <w:r>
               <w:rPr>
-                <w:rFonts w:ascii="굴림체" w:eastAsia="굴림체" w:hAnsi="굴림체" w:hint="eastAsia"/>
+                <w:rFonts w:ascii="GulimChe" w:eastAsia="GulimChe" w:hAnsi="GulimChe" w:hint="eastAsia"/>
                 <w:b/>
                 <w:bCs/>
                 <w:sz w:val="22"/>
@@ -230,43 +214,11 @@
               <w:spacing w:line="240" w:lineRule="exact"/>
               <w:jc w:val="center"/>
               <w:rPr>
-                <w:rFonts w:ascii="굴림체" w:eastAsia="굴림체" w:hAnsi="굴림체"/>
-                <w:sz w:val="22"/>
-                <w:szCs w:val="22"/>
-              </w:rPr>
-            </w:pPr>
-            <w:r>
-              <w:rPr>
-                <w:rFonts w:ascii="굴림체" w:eastAsia="굴림체" w:hAnsi="굴림체" w:hint="eastAsia"/>
-                <w:sz w:val="22"/>
-                <w:szCs w:val="22"/>
-              </w:rPr>
-              <w:t>S</w:t>
-            </w:r>
-            <w:r>
-              <w:rPr>
-                <w:rFonts w:ascii="굴림체" w:eastAsia="굴림체" w:hAnsi="굴림체"/>
-                <w:sz w:val="22"/>
-                <w:szCs w:val="22"/>
-              </w:rPr>
-              <w:t>UW-E00</w:t>
-            </w:r>
-            <w:r>
-              <w:rPr>
-                <w:rFonts w:ascii="굴림체" w:eastAsia="굴림체" w:hAnsi="굴림체"/>
-                <w:sz w:val="22"/>
-                <w:szCs w:val="22"/>
-              </w:rPr>
-              <w:t>2</w:t>
-            </w:r>
-            <w:r>
-              <w:rPr>
-                <w:rFonts w:ascii="굴림체" w:eastAsia="굴림체" w:hAnsi="굴림체"/>
-                <w:sz w:val="22"/>
-                <w:szCs w:val="22"/>
-              </w:rPr>
-              <w:t>2</w:t>
-            </w:r>
+                <w:rFonts w:ascii="GulimChe" w:eastAsia="GulimChe" w:hAnsi="GulimChe"/>
+                <w:sz w:val="22"/>
+                <w:szCs w:val="22"/>
+              </w:rPr>
+            </w:pPr>
           </w:p>
         </w:tc>
         <w:tc>
@@ -286,7 +238,7 @@
               <w:spacing w:line="240" w:lineRule="exact"/>
               <w:jc w:val="center"/>
               <w:rPr>
-                <w:rFonts w:ascii="굴림체" w:eastAsia="굴림체" w:hAnsi="굴림체"/>
+                <w:rFonts w:ascii="GulimChe" w:eastAsia="GulimChe" w:hAnsi="GulimChe"/>
                 <w:b/>
                 <w:bCs/>
                 <w:sz w:val="22"/>
@@ -295,7 +247,7 @@
             </w:pPr>
             <w:r>
               <w:rPr>
-                <w:rFonts w:ascii="굴림체" w:eastAsia="굴림체" w:hAnsi="굴림체" w:hint="eastAsia"/>
+                <w:rFonts w:ascii="GulimChe" w:eastAsia="GulimChe" w:hAnsi="GulimChe" w:hint="eastAsia"/>
                 <w:b/>
                 <w:bCs/>
                 <w:sz w:val="22"/>
@@ -321,35 +273,11 @@
               <w:spacing w:line="240" w:lineRule="exact"/>
               <w:jc w:val="center"/>
               <w:rPr>
-                <w:rFonts w:ascii="굴림체" w:eastAsia="굴림체" w:hAnsi="굴림체"/>
-                <w:sz w:val="22"/>
-                <w:szCs w:val="22"/>
-              </w:rPr>
-            </w:pPr>
-            <w:r>
-              <w:rPr>
-                <w:rFonts w:ascii="굴림체" w:eastAsia="굴림체" w:hAnsi="굴림체" w:hint="eastAsia"/>
-                <w:sz w:val="22"/>
-                <w:szCs w:val="22"/>
-              </w:rPr>
-              <w:t>C</w:t>
-            </w:r>
-            <w:r>
-              <w:rPr>
-                <w:rFonts w:ascii="굴림체" w:eastAsia="굴림체" w:hAnsi="굴림체"/>
-                <w:sz w:val="22"/>
-                <w:szCs w:val="22"/>
-              </w:rPr>
-              <w:t xml:space="preserve">hamber </w:t>
-            </w:r>
-            <w:r>
-              <w:rPr>
-                <w:rFonts w:ascii="굴림체" w:eastAsia="굴림체" w:hAnsi="굴림체"/>
-                <w:sz w:val="22"/>
-                <w:szCs w:val="22"/>
-              </w:rPr>
-              <w:t>1</w:t>
-            </w:r>
+                <w:rFonts w:ascii="GulimChe" w:eastAsia="GulimChe" w:hAnsi="GulimChe"/>
+                <w:sz w:val="22"/>
+                <w:szCs w:val="22"/>
+              </w:rPr>
+            </w:pPr>
           </w:p>
         </w:tc>
       </w:tr>
@@ -375,7 +303,7 @@
               <w:spacing w:line="240" w:lineRule="exact"/>
               <w:jc w:val="center"/>
               <w:rPr>
-                <w:rFonts w:ascii="굴림체" w:eastAsia="굴림체" w:hAnsi="굴림체"/>
+                <w:rFonts w:ascii="GulimChe" w:eastAsia="GulimChe" w:hAnsi="GulimChe"/>
                 <w:b/>
                 <w:bCs/>
                 <w:sz w:val="22"/>
@@ -384,7 +312,7 @@
             </w:pPr>
             <w:r>
               <w:rPr>
-                <w:rFonts w:ascii="굴림체" w:eastAsia="굴림체" w:hAnsi="굴림체" w:hint="eastAsia"/>
+                <w:rFonts w:ascii="GulimChe" w:eastAsia="GulimChe" w:hAnsi="GulimChe" w:hint="eastAsia"/>
                 <w:b/>
                 <w:bCs/>
                 <w:sz w:val="22"/>
@@ -411,27 +339,11 @@
               <w:spacing w:line="240" w:lineRule="exact"/>
               <w:jc w:val="center"/>
               <w:rPr>
-                <w:rFonts w:ascii="굴림체" w:eastAsia="굴림체" w:hAnsi="굴림체"/>
-                <w:sz w:val="22"/>
-                <w:szCs w:val="22"/>
-              </w:rPr>
-            </w:pPr>
-            <w:r>
-              <w:rPr>
-                <w:rFonts w:ascii="굴림체" w:eastAsia="굴림체" w:hAnsi="굴림체" w:hint="eastAsia"/>
-                <w:sz w:val="22"/>
-                <w:szCs w:val="22"/>
-              </w:rPr>
-              <w:t>P</w:t>
-            </w:r>
-            <w:r>
-              <w:rPr>
-                <w:rFonts w:ascii="굴림체" w:eastAsia="굴림체" w:hAnsi="굴림체"/>
-                <w:sz w:val="22"/>
-                <w:szCs w:val="22"/>
-              </w:rPr>
-              <w:t>RE-AMPLIFIER</w:t>
-            </w:r>
+                <w:rFonts w:ascii="GulimChe" w:eastAsia="GulimChe" w:hAnsi="GulimChe"/>
+                <w:sz w:val="22"/>
+                <w:szCs w:val="22"/>
+              </w:rPr>
+            </w:pPr>
           </w:p>
         </w:tc>
         <w:tc>
@@ -451,7 +363,7 @@
               <w:spacing w:line="240" w:lineRule="exact"/>
               <w:jc w:val="center"/>
               <w:rPr>
-                <w:rFonts w:ascii="굴림체" w:eastAsia="굴림체" w:hAnsi="굴림체"/>
+                <w:rFonts w:ascii="GulimChe" w:eastAsia="GulimChe" w:hAnsi="GulimChe"/>
                 <w:b/>
                 <w:bCs/>
                 <w:sz w:val="22"/>
@@ -460,7 +372,7 @@
             </w:pPr>
             <w:r>
               <w:rPr>
-                <w:rFonts w:ascii="굴림체" w:eastAsia="굴림체" w:hAnsi="굴림체" w:hint="eastAsia"/>
+                <w:rFonts w:ascii="GulimChe" w:eastAsia="GulimChe" w:hAnsi="GulimChe" w:hint="eastAsia"/>
                 <w:b/>
                 <w:bCs/>
                 <w:sz w:val="22"/>
@@ -486,19 +398,11 @@
               <w:spacing w:line="240" w:lineRule="exact"/>
               <w:jc w:val="center"/>
               <w:rPr>
-                <w:rFonts w:ascii="굴림체" w:eastAsia="굴림체" w:hAnsi="굴림체"/>
-                <w:sz w:val="22"/>
-                <w:szCs w:val="22"/>
-              </w:rPr>
-            </w:pPr>
-            <w:r>
-              <w:rPr>
-                <w:rFonts w:ascii="굴림체" w:eastAsia="굴림체" w:hAnsi="굴림체"/>
-                <w:sz w:val="22"/>
-                <w:szCs w:val="22"/>
-              </w:rPr>
-              <w:t>3115-PA</w:t>
-            </w:r>
+                <w:rFonts w:ascii="GulimChe" w:eastAsia="GulimChe" w:hAnsi="GulimChe"/>
+                <w:sz w:val="22"/>
+                <w:szCs w:val="22"/>
+              </w:rPr>
+            </w:pPr>
           </w:p>
         </w:tc>
       </w:tr>
@@ -524,7 +428,7 @@
               <w:spacing w:line="240" w:lineRule="exact"/>
               <w:jc w:val="center"/>
               <w:rPr>
-                <w:rFonts w:ascii="굴림체" w:eastAsia="굴림체" w:hAnsi="굴림체"/>
+                <w:rFonts w:ascii="GulimChe" w:eastAsia="GulimChe" w:hAnsi="GulimChe"/>
                 <w:b/>
                 <w:bCs/>
                 <w:sz w:val="22"/>
@@ -533,7 +437,7 @@
             </w:pPr>
             <w:r>
               <w:rPr>
-                <w:rFonts w:ascii="굴림체" w:eastAsia="굴림체" w:hAnsi="굴림체" w:hint="eastAsia"/>
+                <w:rFonts w:ascii="GulimChe" w:eastAsia="GulimChe" w:hAnsi="GulimChe" w:hint="eastAsia"/>
                 <w:b/>
                 <w:bCs/>
                 <w:sz w:val="22"/>
@@ -560,19 +464,11 @@
               <w:spacing w:line="240" w:lineRule="exact"/>
               <w:jc w:val="center"/>
               <w:rPr>
-                <w:rFonts w:ascii="굴림체" w:eastAsia="굴림체" w:hAnsi="굴림체"/>
-                <w:sz w:val="22"/>
-                <w:szCs w:val="22"/>
-              </w:rPr>
-            </w:pPr>
-            <w:r>
-              <w:rPr>
-                <w:rFonts w:ascii="굴림체" w:eastAsia="굴림체" w:hAnsi="굴림체" w:hint="eastAsia"/>
-                <w:sz w:val="22"/>
-                <w:szCs w:val="22"/>
-              </w:rPr>
-              <w:t>6개월</w:t>
-            </w:r>
+                <w:rFonts w:ascii="GulimChe" w:eastAsia="GulimChe" w:hAnsi="GulimChe"/>
+                <w:sz w:val="22"/>
+                <w:szCs w:val="22"/>
+              </w:rPr>
+            </w:pPr>
           </w:p>
         </w:tc>
         <w:tc>
@@ -592,7 +488,7 @@
               <w:spacing w:line="240" w:lineRule="exact"/>
               <w:jc w:val="center"/>
               <w:rPr>
-                <w:rFonts w:ascii="굴림체" w:eastAsia="굴림체" w:hAnsi="굴림체"/>
+                <w:rFonts w:ascii="GulimChe" w:eastAsia="GulimChe" w:hAnsi="GulimChe"/>
                 <w:b/>
                 <w:bCs/>
                 <w:sz w:val="22"/>
@@ -601,7 +497,7 @@
             </w:pPr>
             <w:r>
               <w:rPr>
-                <w:rFonts w:ascii="굴림체" w:eastAsia="굴림체" w:hint="eastAsia"/>
+                <w:rFonts w:ascii="GulimChe" w:eastAsia="GulimChe" w:hint="eastAsia"/>
                 <w:b/>
                 <w:bCs/>
                 <w:sz w:val="22"/>
@@ -627,27 +523,11 @@
               <w:spacing w:line="240" w:lineRule="exact"/>
               <w:jc w:val="center"/>
               <w:rPr>
-                <w:rFonts w:ascii="굴림체" w:eastAsia="굴림체" w:hAnsi="굴림체"/>
-                <w:sz w:val="22"/>
-                <w:szCs w:val="22"/>
-              </w:rPr>
-            </w:pPr>
-            <w:r>
-              <w:rPr>
-                <w:rFonts w:ascii="굴림체" w:eastAsia="굴림체" w:hAnsi="굴림체" w:hint="eastAsia"/>
-                <w:sz w:val="22"/>
-                <w:szCs w:val="22"/>
-              </w:rPr>
-              <w:t>1</w:t>
-            </w:r>
-            <w:r>
-              <w:rPr>
-                <w:rFonts w:ascii="굴림체" w:eastAsia="굴림체" w:hAnsi="굴림체" w:hint="eastAsia"/>
-                <w:sz w:val="22"/>
-                <w:szCs w:val="22"/>
-              </w:rPr>
-              <w:t>년</w:t>
-            </w:r>
+                <w:rFonts w:ascii="GulimChe" w:eastAsia="GulimChe" w:hAnsi="GulimChe"/>
+                <w:sz w:val="22"/>
+                <w:szCs w:val="22"/>
+              </w:rPr>
+            </w:pPr>
           </w:p>
         </w:tc>
       </w:tr>
@@ -672,7 +552,7 @@
               <w:spacing w:line="240" w:lineRule="exact"/>
               <w:jc w:val="center"/>
               <w:rPr>
-                <w:rFonts w:ascii="굴림" w:eastAsia="굴림" w:hAnsi="굴림"/>
+                <w:rFonts w:ascii="Gulim" w:eastAsia="Gulim" w:hAnsi="Gulim"/>
                 <w:sz w:val="10"/>
               </w:rPr>
             </w:pPr>
@@ -701,7 +581,7 @@
               <w:spacing w:line="240" w:lineRule="exact"/>
               <w:jc w:val="center"/>
               <w:rPr>
-                <w:rFonts w:ascii="굴림체" w:eastAsia="굴림체" w:hAnsi="굴림체"/>
+                <w:rFonts w:ascii="GulimChe" w:eastAsia="GulimChe" w:hAnsi="GulimChe"/>
                 <w:b/>
                 <w:bCs/>
                 <w:sz w:val="22"/>
@@ -710,7 +590,7 @@
             </w:pPr>
             <w:r>
               <w:rPr>
-                <w:rFonts w:ascii="굴림체" w:eastAsia="굴림체" w:hAnsi="굴림체" w:hint="eastAsia"/>
+                <w:rFonts w:ascii="GulimChe" w:eastAsia="GulimChe" w:hAnsi="GulimChe" w:hint="eastAsia"/>
                 <w:b/>
                 <w:bCs/>
                 <w:sz w:val="22"/>
@@ -738,7 +618,7 @@
               <w:spacing w:line="240" w:lineRule="exact"/>
               <w:jc w:val="center"/>
               <w:rPr>
-                <w:rFonts w:ascii="굴림체" w:eastAsia="굴림체" w:hAnsi="굴림체"/>
+                <w:rFonts w:ascii="GulimChe" w:eastAsia="GulimChe" w:hAnsi="GulimChe"/>
                 <w:b/>
                 <w:bCs/>
                 <w:sz w:val="22"/>
@@ -747,7 +627,7 @@
             </w:pPr>
             <w:r>
               <w:rPr>
-                <w:rFonts w:ascii="굴림체" w:eastAsia="굴림체" w:hAnsi="굴림체" w:hint="eastAsia"/>
+                <w:rFonts w:ascii="GulimChe" w:eastAsia="GulimChe" w:hAnsi="GulimChe" w:hint="eastAsia"/>
                 <w:b/>
                 <w:bCs/>
                 <w:sz w:val="22"/>
@@ -775,7 +655,7 @@
               <w:spacing w:line="240" w:lineRule="exact"/>
               <w:jc w:val="center"/>
               <w:rPr>
-                <w:rFonts w:ascii="굴림체" w:eastAsia="굴림체" w:hAnsi="굴림체"/>
+                <w:rFonts w:ascii="GulimChe" w:eastAsia="GulimChe" w:hAnsi="GulimChe"/>
                 <w:b/>
                 <w:bCs/>
                 <w:sz w:val="22"/>
@@ -784,7 +664,7 @@
             </w:pPr>
             <w:r>
               <w:rPr>
-                <w:rFonts w:ascii="굴림체" w:eastAsia="굴림체" w:hAnsi="굴림체" w:hint="eastAsia"/>
+                <w:rFonts w:ascii="GulimChe" w:eastAsia="GulimChe" w:hAnsi="GulimChe" w:hint="eastAsia"/>
                 <w:b/>
                 <w:bCs/>
                 <w:sz w:val="22"/>
@@ -811,7 +691,7 @@
               <w:spacing w:line="240" w:lineRule="exact"/>
               <w:jc w:val="center"/>
               <w:rPr>
-                <w:rFonts w:ascii="굴림체" w:eastAsia="굴림체" w:hAnsi="굴림체"/>
+                <w:rFonts w:ascii="GulimChe" w:eastAsia="GulimChe" w:hAnsi="GulimChe"/>
                 <w:b/>
                 <w:bCs/>
                 <w:sz w:val="22"/>
@@ -820,7 +700,7 @@
             </w:pPr>
             <w:r>
               <w:rPr>
-                <w:rFonts w:ascii="굴림체" w:eastAsia="굴림체" w:hAnsi="굴림체" w:hint="eastAsia"/>
+                <w:rFonts w:ascii="GulimChe" w:eastAsia="GulimChe" w:hAnsi="GulimChe" w:hint="eastAsia"/>
                 <w:b/>
                 <w:bCs/>
                 <w:sz w:val="22"/>
@@ -847,7 +727,7 @@
               <w:spacing w:line="240" w:lineRule="exact"/>
               <w:jc w:val="center"/>
               <w:rPr>
-                <w:rFonts w:ascii="굴림체" w:eastAsia="굴림체" w:hAnsi="굴림체"/>
+                <w:rFonts w:ascii="GulimChe" w:eastAsia="GulimChe" w:hAnsi="GulimChe"/>
                 <w:b/>
                 <w:bCs/>
                 <w:sz w:val="22"/>
@@ -856,7 +736,7 @@
             </w:pPr>
             <w:r>
               <w:rPr>
-                <w:rFonts w:ascii="굴림체" w:eastAsia="굴림체" w:hAnsi="굴림체" w:hint="eastAsia"/>
+                <w:rFonts w:ascii="GulimChe" w:eastAsia="GulimChe" w:hAnsi="GulimChe" w:hint="eastAsia"/>
                 <w:b/>
                 <w:bCs/>
                 <w:sz w:val="22"/>
@@ -866,7 +746,7 @@
             </w:r>
             <w:r>
               <w:rPr>
-                <w:rFonts w:ascii="굴림체" w:eastAsia="굴림체" w:hAnsi="굴림체"/>
+                <w:rFonts w:ascii="GulimChe" w:eastAsia="GulimChe" w:hAnsi="GulimChe"/>
                 <w:b/>
                 <w:bCs/>
                 <w:sz w:val="22"/>
@@ -876,7 +756,7 @@
             </w:r>
             <w:r>
               <w:rPr>
-                <w:rFonts w:ascii="굴림체" w:eastAsia="굴림체" w:hAnsi="굴림체" w:hint="eastAsia"/>
+                <w:rFonts w:ascii="GulimChe" w:eastAsia="GulimChe" w:hAnsi="GulimChe" w:hint="eastAsia"/>
                 <w:b/>
                 <w:bCs/>
                 <w:sz w:val="22"/>
@@ -909,14 +789,14 @@
               <w:ind w:left="220" w:hangingChars="100" w:hanging="220"/>
               <w:jc w:val="center"/>
               <w:rPr>
-                <w:rFonts w:ascii="굴림체" w:eastAsia="굴림체" w:hAnsi="굴림체"/>
+                <w:rFonts w:ascii="GulimChe" w:eastAsia="GulimChe" w:hAnsi="GulimChe"/>
                 <w:sz w:val="22"/>
                 <w:szCs w:val="22"/>
               </w:rPr>
             </w:pPr>
             <w:r>
               <w:rPr>
-                <w:rFonts w:ascii="굴림체" w:eastAsia="굴림체" w:hAnsi="굴림체" w:hint="eastAsia"/>
+                <w:rFonts w:ascii="GulimChe" w:eastAsia="GulimChe" w:hAnsi="GulimChe" w:hint="eastAsia"/>
                 <w:sz w:val="22"/>
                 <w:szCs w:val="22"/>
               </w:rPr>
@@ -942,19 +822,11 @@
               <w:ind w:left="220" w:hangingChars="100" w:hanging="220"/>
               <w:jc w:val="center"/>
               <w:rPr>
-                <w:rFonts w:ascii="굴림체" w:eastAsia="굴림체" w:hAnsi="굴림체"/>
-                <w:sz w:val="22"/>
-                <w:szCs w:val="22"/>
-              </w:rPr>
-            </w:pPr>
-            <w:r>
-              <w:rPr>
-                <w:rFonts w:ascii="굴림체" w:eastAsia="굴림체" w:hAnsi="굴림체" w:hint="eastAsia"/>
-                <w:sz w:val="22"/>
-                <w:szCs w:val="22"/>
-              </w:rPr>
-              <w:t>외관 검사</w:t>
-            </w:r>
+                <w:rFonts w:ascii="GulimChe" w:eastAsia="GulimChe" w:hAnsi="GulimChe"/>
+                <w:sz w:val="22"/>
+                <w:szCs w:val="22"/>
+              </w:rPr>
+            </w:pPr>
           </w:p>
         </w:tc>
         <w:tc>
@@ -975,19 +847,11 @@
               <w:ind w:left="220" w:hangingChars="100" w:hanging="220"/>
               <w:jc w:val="center"/>
               <w:rPr>
-                <w:rFonts w:ascii="굴림체" w:eastAsia="굴림체" w:hAnsi="굴림체"/>
-                <w:sz w:val="22"/>
-                <w:szCs w:val="22"/>
-              </w:rPr>
-            </w:pPr>
-            <w:r>
-              <w:rPr>
-                <w:rFonts w:ascii="굴림체" w:eastAsia="굴림체" w:hAnsi="굴림체" w:hint="eastAsia"/>
-                <w:sz w:val="22"/>
-                <w:szCs w:val="22"/>
-              </w:rPr>
-              <w:t>마모 상태 확인</w:t>
-            </w:r>
+                <w:rFonts w:ascii="GulimChe" w:eastAsia="GulimChe" w:hAnsi="GulimChe"/>
+                <w:sz w:val="22"/>
+                <w:szCs w:val="22"/>
+              </w:rPr>
+            </w:pPr>
           </w:p>
         </w:tc>
         <w:tc>
@@ -1007,19 +871,11 @@
               <w:ind w:left="220" w:hangingChars="100" w:hanging="220"/>
               <w:jc w:val="center"/>
               <w:rPr>
-                <w:rFonts w:ascii="굴림체" w:eastAsia="굴림체" w:hAnsi="굴림체"/>
-                <w:sz w:val="22"/>
-                <w:szCs w:val="22"/>
-              </w:rPr>
-            </w:pPr>
-            <w:r>
-              <w:rPr>
-                <w:rFonts w:ascii="굴림체" w:eastAsia="굴림체" w:hAnsi="굴림체" w:hint="eastAsia"/>
-                <w:sz w:val="22"/>
-                <w:szCs w:val="22"/>
-              </w:rPr>
-              <w:t>이상 없음</w:t>
-            </w:r>
+                <w:rFonts w:ascii="GulimChe" w:eastAsia="GulimChe" w:hAnsi="GulimChe"/>
+                <w:sz w:val="22"/>
+                <w:szCs w:val="22"/>
+              </w:rPr>
+            </w:pPr>
           </w:p>
         </w:tc>
         <w:tc>
@@ -1038,19 +894,11 @@
               <w:spacing w:line="240" w:lineRule="exact"/>
               <w:jc w:val="center"/>
               <w:rPr>
-                <w:rFonts w:ascii="굴림체" w:eastAsia="굴림체" w:hAnsi="굴림체"/>
-                <w:sz w:val="22"/>
-                <w:szCs w:val="22"/>
-              </w:rPr>
-            </w:pPr>
-            <w:r>
-              <w:rPr>
-                <w:rFonts w:ascii="굴림체" w:eastAsia="굴림체" w:hAnsi="굴림체" w:hint="eastAsia"/>
-                <w:sz w:val="22"/>
-                <w:szCs w:val="22"/>
-              </w:rPr>
-              <w:t>합격</w:t>
-            </w:r>
+                <w:rFonts w:ascii="GulimChe" w:eastAsia="GulimChe" w:hAnsi="GulimChe"/>
+                <w:sz w:val="22"/>
+                <w:szCs w:val="22"/>
+              </w:rPr>
+            </w:pPr>
           </w:p>
         </w:tc>
       </w:tr>
@@ -1075,14 +923,14 @@
               <w:spacing w:line="240" w:lineRule="exact"/>
               <w:jc w:val="center"/>
               <w:rPr>
-                <w:rFonts w:ascii="굴림체" w:eastAsia="굴림체" w:hAnsi="굴림체"/>
+                <w:rFonts w:ascii="GulimChe" w:eastAsia="GulimChe" w:hAnsi="GulimChe"/>
                 <w:sz w:val="22"/>
                 <w:szCs w:val="22"/>
               </w:rPr>
             </w:pPr>
             <w:r>
               <w:rPr>
-                <w:rFonts w:ascii="굴림체" w:eastAsia="굴림체" w:hAnsi="굴림체" w:hint="eastAsia"/>
+                <w:rFonts w:ascii="GulimChe" w:eastAsia="GulimChe" w:hAnsi="GulimChe" w:hint="eastAsia"/>
                 <w:sz w:val="22"/>
                 <w:szCs w:val="22"/>
               </w:rPr>
@@ -1107,19 +955,11 @@
               <w:spacing w:line="240" w:lineRule="exact"/>
               <w:jc w:val="center"/>
               <w:rPr>
-                <w:rFonts w:ascii="굴림체" w:eastAsia="굴림체" w:hAnsi="굴림체"/>
-                <w:sz w:val="22"/>
-                <w:szCs w:val="22"/>
-              </w:rPr>
-            </w:pPr>
-            <w:r>
-              <w:rPr>
-                <w:rFonts w:ascii="굴림체" w:eastAsia="굴림체" w:hAnsi="굴림체" w:hint="eastAsia"/>
-                <w:sz w:val="22"/>
-                <w:szCs w:val="22"/>
-              </w:rPr>
-              <w:t>출력 특성 점검</w:t>
-            </w:r>
+                <w:rFonts w:ascii="GulimChe" w:eastAsia="GulimChe" w:hAnsi="GulimChe"/>
+                <w:sz w:val="22"/>
+                <w:szCs w:val="22"/>
+              </w:rPr>
+            </w:pPr>
           </w:p>
         </w:tc>
         <w:tc>
@@ -1139,86 +979,11 @@
               <w:spacing w:line="240" w:lineRule="exact"/>
               <w:jc w:val="center"/>
               <w:rPr>
-                <w:rFonts w:ascii="굴림체" w:eastAsia="굴림체" w:hAnsi="굴림체"/>
-                <w:sz w:val="22"/>
-                <w:szCs w:val="22"/>
-              </w:rPr>
-            </w:pPr>
-            <w:r>
-              <w:rPr>
-                <w:rFonts w:ascii="굴림체" w:eastAsia="굴림체" w:hAnsi="굴림체" w:hint="eastAsia"/>
-                <w:sz w:val="22"/>
-                <w:szCs w:val="22"/>
-              </w:rPr>
-              <w:t xml:space="preserve">제조사 </w:t>
-            </w:r>
-            <w:r>
-              <w:rPr>
-                <w:rFonts w:ascii="굴림체" w:eastAsia="굴림체" w:hAnsi="굴림체" w:hint="eastAsia"/>
-                <w:sz w:val="22"/>
-                <w:szCs w:val="22"/>
-              </w:rPr>
-              <w:t xml:space="preserve">선언 </w:t>
-            </w:r>
-            <w:r>
-              <w:rPr>
-                <w:rFonts w:ascii="굴림체" w:eastAsia="굴림체" w:hAnsi="굴림체" w:hint="eastAsia"/>
-                <w:sz w:val="22"/>
-                <w:szCs w:val="22"/>
-              </w:rPr>
-              <w:t>오차범위 이내 일 것.</w:t>
-            </w:r>
-          </w:p>
-          <w:p>
-            <w:pPr>
-              <w:spacing w:line="240" w:lineRule="exact"/>
-              <w:jc w:val="center"/>
-              <w:rPr>
-                <w:rFonts w:ascii="굴림체" w:eastAsia="굴림체" w:hAnsi="굴림체"/>
-                <w:sz w:val="22"/>
-                <w:szCs w:val="22"/>
-              </w:rPr>
-            </w:pPr>
-            <w:r>
-              <w:rPr>
-                <w:rFonts w:ascii="굴림체" w:eastAsia="굴림체" w:hAnsi="굴림체" w:hint="eastAsia"/>
-                <w:sz w:val="22"/>
-                <w:szCs w:val="22"/>
-              </w:rPr>
-              <w:t>(</w:t>
-            </w:r>
-            <w:r>
-              <w:rPr>
-                <w:rFonts w:ascii="굴림체" w:eastAsia="굴림체" w:hAnsi="굴림체"/>
-                <w:sz w:val="22"/>
-                <w:szCs w:val="22"/>
-              </w:rPr>
-              <w:t xml:space="preserve">45 </w:t>
-            </w:r>
-            <w:r>
-              <w:rPr>
-                <w:rFonts w:ascii="굴림체" w:eastAsia="굴림체" w:hAnsi="굴림체"/>
-                <w:sz w:val="22"/>
-                <w:szCs w:val="22"/>
-              </w:rPr>
-              <w:t>±</w:t>
-            </w:r>
-            <w:r>
-              <w:rPr>
-                <w:rFonts w:ascii="굴림체" w:eastAsia="굴림체" w:hAnsi="굴림체"/>
-                <w:sz w:val="22"/>
-                <w:szCs w:val="22"/>
-              </w:rPr>
-              <w:t xml:space="preserve"> </w:t>
-            </w:r>
-            <w:r>
-              <w:rPr>
-                <w:rFonts w:ascii="굴림체" w:eastAsia="굴림체" w:hAnsi="굴림체"/>
-                <w:sz w:val="22"/>
-                <w:szCs w:val="22"/>
-              </w:rPr>
-              <w:t>2.5 dB)</w:t>
-            </w:r>
+                <w:rFonts w:ascii="GulimChe" w:eastAsia="GulimChe" w:hAnsi="GulimChe"/>
+                <w:sz w:val="22"/>
+                <w:szCs w:val="22"/>
+              </w:rPr>
+            </w:pPr>
           </w:p>
         </w:tc>
         <w:tc>
@@ -1237,122 +1002,11 @@
               <w:spacing w:line="240" w:lineRule="exact"/>
               <w:jc w:val="center"/>
               <w:rPr>
-                <w:rFonts w:ascii="굴림체" w:eastAsia="굴림체" w:hAnsi="굴림체"/>
-                <w:sz w:val="16"/>
-                <w:szCs w:val="16"/>
-              </w:rPr>
-            </w:pPr>
-            <w:proofErr w:type="gramStart"/>
-            <w:r>
-              <w:rPr>
-                <w:rFonts w:ascii="굴림체" w:eastAsia="굴림체" w:hAnsi="굴림체" w:hint="eastAsia"/>
-                <w:sz w:val="16"/>
-                <w:szCs w:val="16"/>
-              </w:rPr>
-              <w:t>M</w:t>
-            </w:r>
-            <w:r>
-              <w:rPr>
-                <w:rFonts w:ascii="굴림체" w:eastAsia="굴림체" w:hAnsi="굴림체"/>
-                <w:sz w:val="16"/>
-                <w:szCs w:val="16"/>
-              </w:rPr>
-              <w:t>in :</w:t>
-            </w:r>
-            <w:proofErr w:type="gramEnd"/>
-            <w:r>
-              <w:rPr>
-                <w:rFonts w:ascii="굴림체" w:eastAsia="굴림체" w:hAnsi="굴림체"/>
-                <w:sz w:val="16"/>
-                <w:szCs w:val="16"/>
-              </w:rPr>
-              <w:t xml:space="preserve"> </w:t>
-            </w:r>
-            <w:r>
-              <w:rPr>
-                <w:rFonts w:ascii="굴림체" w:eastAsia="굴림체" w:hAnsi="굴림체"/>
-                <w:sz w:val="16"/>
-                <w:szCs w:val="16"/>
-              </w:rPr>
-              <w:t>4</w:t>
-            </w:r>
-            <w:r>
-              <w:rPr>
-                <w:rFonts w:ascii="굴림체" w:eastAsia="굴림체" w:hAnsi="굴림체" w:hint="eastAsia"/>
-                <w:sz w:val="16"/>
-                <w:szCs w:val="16"/>
-              </w:rPr>
-              <w:t>3.</w:t>
-            </w:r>
-            <w:r>
-              <w:rPr>
-                <w:rFonts w:ascii="굴림체" w:eastAsia="굴림체" w:hAnsi="굴림체" w:hint="eastAsia"/>
-                <w:sz w:val="16"/>
-                <w:szCs w:val="16"/>
-              </w:rPr>
-              <w:t>63</w:t>
-            </w:r>
-            <w:r>
-              <w:rPr>
-                <w:rFonts w:ascii="굴림체" w:eastAsia="굴림체" w:hAnsi="굴림체"/>
-                <w:sz w:val="16"/>
-                <w:szCs w:val="16"/>
-              </w:rPr>
-              <w:t xml:space="preserve"> dB</w:t>
-            </w:r>
-          </w:p>
-          <w:p>
-            <w:pPr>
-              <w:spacing w:line="240" w:lineRule="exact"/>
-              <w:jc w:val="center"/>
-              <w:rPr>
-                <w:rFonts w:ascii="굴림체" w:eastAsia="굴림체" w:hAnsi="굴림체"/>
-                <w:sz w:val="22"/>
-                <w:szCs w:val="22"/>
-              </w:rPr>
-            </w:pPr>
-            <w:proofErr w:type="gramStart"/>
-            <w:r>
-              <w:rPr>
-                <w:rFonts w:ascii="굴림체" w:eastAsia="굴림체" w:hAnsi="굴림체" w:hint="eastAsia"/>
-                <w:sz w:val="16"/>
-                <w:szCs w:val="16"/>
-              </w:rPr>
-              <w:t>M</w:t>
-            </w:r>
-            <w:r>
-              <w:rPr>
-                <w:rFonts w:ascii="굴림체" w:eastAsia="굴림체" w:hAnsi="굴림체"/>
-                <w:sz w:val="16"/>
-                <w:szCs w:val="16"/>
-              </w:rPr>
-              <w:t>ax :</w:t>
-            </w:r>
-            <w:proofErr w:type="gramEnd"/>
-            <w:r>
-              <w:rPr>
-                <w:rFonts w:ascii="굴림체" w:eastAsia="굴림체" w:hAnsi="굴림체"/>
-                <w:sz w:val="16"/>
-                <w:szCs w:val="16"/>
-              </w:rPr>
-              <w:t xml:space="preserve"> 46.</w:t>
-            </w:r>
-            <w:r>
-              <w:rPr>
-                <w:rFonts w:ascii="굴림체" w:eastAsia="굴림체" w:hAnsi="굴림체" w:hint="eastAsia"/>
-                <w:sz w:val="16"/>
-                <w:szCs w:val="16"/>
-              </w:rPr>
-              <w:t>73</w:t>
-            </w:r>
-            <w:r>
-              <w:rPr>
-                <w:rFonts w:ascii="굴림체" w:eastAsia="굴림체" w:hAnsi="굴림체"/>
-                <w:sz w:val="16"/>
-                <w:szCs w:val="16"/>
-              </w:rPr>
-              <w:t xml:space="preserve"> dB</w:t>
-            </w:r>
+                <w:rFonts w:ascii="GulimChe" w:eastAsia="GulimChe" w:hAnsi="GulimChe"/>
+                <w:sz w:val="22"/>
+                <w:szCs w:val="22"/>
+              </w:rPr>
+            </w:pPr>
           </w:p>
         </w:tc>
         <w:tc>
@@ -1371,19 +1025,11 @@
               <w:spacing w:line="240" w:lineRule="exact"/>
               <w:jc w:val="center"/>
               <w:rPr>
-                <w:rFonts w:ascii="굴림체" w:eastAsia="굴림체" w:hAnsi="굴림체"/>
-                <w:sz w:val="22"/>
-                <w:szCs w:val="22"/>
-              </w:rPr>
-            </w:pPr>
-            <w:r>
-              <w:rPr>
-                <w:rFonts w:ascii="굴림체" w:eastAsia="굴림체" w:hAnsi="굴림체" w:hint="eastAsia"/>
-                <w:sz w:val="22"/>
-                <w:szCs w:val="22"/>
-              </w:rPr>
-              <w:t>합격</w:t>
-            </w:r>
+                <w:rFonts w:ascii="GulimChe" w:eastAsia="GulimChe" w:hAnsi="GulimChe"/>
+                <w:sz w:val="22"/>
+                <w:szCs w:val="22"/>
+              </w:rPr>
+            </w:pPr>
           </w:p>
         </w:tc>
       </w:tr>
@@ -1409,7 +1055,7 @@
               <w:ind w:left="220" w:hangingChars="100" w:hanging="220"/>
               <w:jc w:val="center"/>
               <w:rPr>
-                <w:rFonts w:ascii="굴림체" w:eastAsia="굴림체" w:hAnsi="굴림체"/>
+                <w:rFonts w:ascii="GulimChe" w:eastAsia="GulimChe" w:hAnsi="GulimChe"/>
                 <w:sz w:val="22"/>
                 <w:szCs w:val="22"/>
               </w:rPr>
@@ -1434,7 +1080,7 @@
               <w:ind w:left="220" w:hangingChars="100" w:hanging="220"/>
               <w:jc w:val="center"/>
               <w:rPr>
-                <w:rFonts w:ascii="굴림체" w:eastAsia="굴림체" w:hAnsi="굴림체"/>
+                <w:rFonts w:ascii="GulimChe" w:eastAsia="GulimChe" w:hAnsi="GulimChe"/>
                 <w:sz w:val="22"/>
                 <w:szCs w:val="22"/>
               </w:rPr>
@@ -1459,7 +1105,7 @@
               <w:ind w:left="220" w:hangingChars="100" w:hanging="220"/>
               <w:jc w:val="center"/>
               <w:rPr>
-                <w:rFonts w:ascii="굴림체" w:eastAsia="굴림체" w:hAnsi="굴림체"/>
+                <w:rFonts w:ascii="GulimChe" w:eastAsia="GulimChe" w:hAnsi="GulimChe"/>
                 <w:sz w:val="22"/>
                 <w:szCs w:val="22"/>
               </w:rPr>
@@ -1483,7 +1129,7 @@
               <w:ind w:left="220" w:hangingChars="100" w:hanging="220"/>
               <w:jc w:val="center"/>
               <w:rPr>
-                <w:rFonts w:ascii="굴림체" w:eastAsia="굴림체" w:hAnsi="굴림체"/>
+                <w:rFonts w:ascii="GulimChe" w:eastAsia="GulimChe" w:hAnsi="GulimChe"/>
                 <w:sz w:val="22"/>
                 <w:szCs w:val="22"/>
               </w:rPr>
@@ -1506,7 +1152,7 @@
               <w:spacing w:line="240" w:lineRule="exact"/>
               <w:jc w:val="center"/>
               <w:rPr>
-                <w:rFonts w:ascii="굴림체" w:eastAsia="굴림체" w:hAnsi="굴림체"/>
+                <w:rFonts w:ascii="GulimChe" w:eastAsia="GulimChe" w:hAnsi="GulimChe"/>
                 <w:sz w:val="22"/>
                 <w:szCs w:val="22"/>
               </w:rPr>
@@ -1536,7 +1182,7 @@
               <w:ind w:left="220" w:hangingChars="100" w:hanging="220"/>
               <w:jc w:val="center"/>
               <w:rPr>
-                <w:rFonts w:ascii="굴림체" w:eastAsia="굴림체" w:hAnsi="굴림체"/>
+                <w:rFonts w:ascii="GulimChe" w:eastAsia="GulimChe" w:hAnsi="GulimChe"/>
                 <w:sz w:val="22"/>
                 <w:szCs w:val="22"/>
               </w:rPr>
@@ -1561,7 +1207,7 @@
               <w:ind w:left="220" w:hangingChars="100" w:hanging="220"/>
               <w:jc w:val="center"/>
               <w:rPr>
-                <w:rFonts w:ascii="굴림체" w:eastAsia="굴림체" w:hAnsi="굴림체"/>
+                <w:rFonts w:ascii="GulimChe" w:eastAsia="GulimChe" w:hAnsi="GulimChe"/>
                 <w:sz w:val="22"/>
                 <w:szCs w:val="22"/>
               </w:rPr>
@@ -1586,7 +1232,7 @@
               <w:ind w:left="220" w:hangingChars="100" w:hanging="220"/>
               <w:jc w:val="center"/>
               <w:rPr>
-                <w:rFonts w:ascii="굴림체" w:eastAsia="굴림체" w:hAnsi="굴림체"/>
+                <w:rFonts w:ascii="GulimChe" w:eastAsia="GulimChe" w:hAnsi="GulimChe"/>
                 <w:sz w:val="22"/>
                 <w:szCs w:val="22"/>
               </w:rPr>
@@ -1610,7 +1256,7 @@
               <w:ind w:left="220" w:hangingChars="100" w:hanging="220"/>
               <w:jc w:val="center"/>
               <w:rPr>
-                <w:rFonts w:ascii="굴림체" w:eastAsia="굴림체" w:hAnsi="굴림체"/>
+                <w:rFonts w:ascii="GulimChe" w:eastAsia="GulimChe" w:hAnsi="GulimChe"/>
                 <w:sz w:val="22"/>
                 <w:szCs w:val="22"/>
               </w:rPr>
@@ -1633,7 +1279,7 @@
               <w:spacing w:line="240" w:lineRule="exact"/>
               <w:jc w:val="center"/>
               <w:rPr>
-                <w:rFonts w:ascii="굴림체" w:eastAsia="굴림체" w:hAnsi="굴림체"/>
+                <w:rFonts w:ascii="GulimChe" w:eastAsia="GulimChe" w:hAnsi="GulimChe"/>
                 <w:sz w:val="22"/>
                 <w:szCs w:val="22"/>
               </w:rPr>
@@ -1663,7 +1309,7 @@
               <w:ind w:left="220" w:hangingChars="100" w:hanging="220"/>
               <w:jc w:val="center"/>
               <w:rPr>
-                <w:rFonts w:ascii="굴림체" w:eastAsia="굴림체" w:hAnsi="굴림체"/>
+                <w:rFonts w:ascii="GulimChe" w:eastAsia="GulimChe" w:hAnsi="GulimChe"/>
                 <w:sz w:val="22"/>
                 <w:szCs w:val="22"/>
               </w:rPr>
@@ -1687,7 +1333,7 @@
               <w:spacing w:line="240" w:lineRule="exact"/>
               <w:ind w:left="220" w:hangingChars="100" w:hanging="220"/>
               <w:rPr>
-                <w:rFonts w:ascii="굴림체" w:eastAsia="굴림체" w:hAnsi="굴림체"/>
+                <w:rFonts w:ascii="GulimChe" w:eastAsia="GulimChe" w:hAnsi="GulimChe"/>
                 <w:sz w:val="22"/>
                 <w:szCs w:val="22"/>
               </w:rPr>
@@ -1711,7 +1357,7 @@
               <w:spacing w:line="240" w:lineRule="exact"/>
               <w:ind w:left="220" w:hangingChars="100" w:hanging="220"/>
               <w:rPr>
-                <w:rFonts w:ascii="굴림체" w:eastAsia="굴림체" w:hAnsi="굴림체"/>
+                <w:rFonts w:ascii="GulimChe" w:eastAsia="GulimChe" w:hAnsi="GulimChe"/>
                 <w:sz w:val="22"/>
                 <w:szCs w:val="22"/>
               </w:rPr>
@@ -1734,7 +1380,7 @@
               <w:spacing w:line="240" w:lineRule="exact"/>
               <w:ind w:left="220" w:hangingChars="100" w:hanging="220"/>
               <w:rPr>
-                <w:rFonts w:ascii="굴림체" w:eastAsia="굴림체" w:hAnsi="굴림체"/>
+                <w:rFonts w:ascii="GulimChe" w:eastAsia="GulimChe" w:hAnsi="GulimChe"/>
                 <w:sz w:val="22"/>
                 <w:szCs w:val="22"/>
               </w:rPr>
@@ -1757,7 +1403,7 @@
               <w:spacing w:line="240" w:lineRule="exact"/>
               <w:jc w:val="center"/>
               <w:rPr>
-                <w:rFonts w:ascii="굴림체" w:eastAsia="굴림체" w:hAnsi="굴림체"/>
+                <w:rFonts w:ascii="GulimChe" w:eastAsia="GulimChe" w:hAnsi="GulimChe"/>
                 <w:b/>
                 <w:bCs/>
                 <w:sz w:val="22"/>
@@ -1830,7 +1476,7 @@
               <w:spacing w:line="240" w:lineRule="exact"/>
               <w:jc w:val="center"/>
               <w:rPr>
-                <w:rFonts w:ascii="굴림체" w:eastAsia="굴림체" w:hAnsi="굴림체"/>
+                <w:rFonts w:ascii="GulimChe" w:eastAsia="GulimChe" w:hAnsi="GulimChe"/>
                 <w:b/>
                 <w:sz w:val="22"/>
                 <w:szCs w:val="22"/>
@@ -1838,7 +1484,7 @@
             </w:pPr>
             <w:r>
               <w:rPr>
-                <w:rFonts w:ascii="굴림체" w:eastAsia="굴림체" w:hAnsi="굴림체" w:hint="eastAsia"/>
+                <w:rFonts w:ascii="GulimChe" w:eastAsia="GulimChe" w:hAnsi="GulimChe" w:hint="eastAsia"/>
                 <w:b/>
                 <w:sz w:val="22"/>
                 <w:szCs w:val="22"/>
@@ -1847,7 +1493,7 @@
             </w:r>
             <w:r>
               <w:rPr>
-                <w:rFonts w:ascii="굴림체" w:eastAsia="굴림체" w:hAnsi="굴림체" w:hint="eastAsia"/>
+                <w:rFonts w:ascii="GulimChe" w:eastAsia="GulimChe" w:hAnsi="GulimChe" w:hint="eastAsia"/>
                 <w:b/>
                 <w:sz w:val="22"/>
                 <w:szCs w:val="22"/>
@@ -1879,7 +1525,7 @@
               <w:spacing w:line="240" w:lineRule="exact"/>
               <w:jc w:val="center"/>
               <w:rPr>
-                <w:rFonts w:ascii="굴림체" w:eastAsia="굴림체" w:hAnsi="굴림체"/>
+                <w:rFonts w:ascii="GulimChe" w:eastAsia="GulimChe" w:hAnsi="GulimChe"/>
                 <w:b/>
                 <w:bCs/>
                 <w:sz w:val="22"/>
@@ -1888,7 +1534,7 @@
             </w:pPr>
             <w:r>
               <w:rPr>
-                <w:rFonts w:ascii="굴림체" w:eastAsia="굴림체" w:hAnsi="굴림체" w:hint="eastAsia"/>
+                <w:rFonts w:ascii="GulimChe" w:eastAsia="GulimChe" w:hAnsi="GulimChe" w:hint="eastAsia"/>
                 <w:b/>
                 <w:bCs/>
                 <w:sz w:val="22"/>
@@ -1915,7 +1561,7 @@
               <w:spacing w:line="240" w:lineRule="exact"/>
               <w:jc w:val="center"/>
               <w:rPr>
-                <w:rFonts w:ascii="굴림체" w:eastAsia="굴림체" w:hAnsi="굴림체"/>
+                <w:rFonts w:ascii="GulimChe" w:eastAsia="GulimChe" w:hAnsi="GulimChe"/>
                 <w:b/>
                 <w:bCs/>
                 <w:sz w:val="22"/>
@@ -1924,7 +1570,7 @@
             </w:pPr>
             <w:r>
               <w:rPr>
-                <w:rFonts w:ascii="굴림체" w:eastAsia="굴림체" w:hAnsi="굴림체" w:hint="eastAsia"/>
+                <w:rFonts w:ascii="GulimChe" w:eastAsia="GulimChe" w:hAnsi="GulimChe" w:hint="eastAsia"/>
                 <w:b/>
                 <w:bCs/>
                 <w:sz w:val="22"/>
@@ -1934,7 +1580,7 @@
             </w:r>
             <w:r>
               <w:rPr>
-                <w:rFonts w:ascii="굴림체" w:eastAsia="굴림체" w:hAnsi="굴림체" w:hint="eastAsia"/>
+                <w:rFonts w:ascii="GulimChe" w:eastAsia="GulimChe" w:hAnsi="GulimChe" w:hint="eastAsia"/>
                 <w:b/>
                 <w:bCs/>
                 <w:sz w:val="22"/>
@@ -1944,7 +1590,7 @@
             </w:r>
             <w:r>
               <w:rPr>
-                <w:rFonts w:ascii="굴림체" w:eastAsia="굴림체" w:hAnsi="굴림체" w:hint="eastAsia"/>
+                <w:rFonts w:ascii="GulimChe" w:eastAsia="GulimChe" w:hAnsi="GulimChe" w:hint="eastAsia"/>
                 <w:b/>
                 <w:bCs/>
                 <w:sz w:val="22"/>
@@ -1954,7 +1600,7 @@
             </w:r>
             <w:r>
               <w:rPr>
-                <w:rFonts w:ascii="굴림체" w:eastAsia="굴림체" w:hAnsi="굴림체" w:hint="eastAsia"/>
+                <w:rFonts w:ascii="GulimChe" w:eastAsia="GulimChe" w:hAnsi="GulimChe" w:hint="eastAsia"/>
                 <w:b/>
                 <w:bCs/>
                 <w:sz w:val="22"/>
@@ -1964,7 +1610,7 @@
             </w:r>
             <w:r>
               <w:rPr>
-                <w:rFonts w:ascii="굴림체" w:eastAsia="굴림체" w:hAnsi="굴림체" w:hint="eastAsia"/>
+                <w:rFonts w:ascii="GulimChe" w:eastAsia="GulimChe" w:hAnsi="GulimChe" w:hint="eastAsia"/>
                 <w:b/>
                 <w:bCs/>
                 <w:sz w:val="22"/>
@@ -1974,7 +1620,7 @@
             </w:r>
             <w:r>
               <w:rPr>
-                <w:rFonts w:ascii="굴림체" w:eastAsia="굴림체" w:hAnsi="굴림체" w:hint="eastAsia"/>
+                <w:rFonts w:ascii="GulimChe" w:eastAsia="GulimChe" w:hAnsi="GulimChe" w:hint="eastAsia"/>
                 <w:b/>
                 <w:bCs/>
                 <w:sz w:val="22"/>
@@ -1984,7 +1630,7 @@
             </w:r>
             <w:r>
               <w:rPr>
-                <w:rFonts w:ascii="굴림체" w:eastAsia="굴림체" w:hAnsi="굴림체" w:hint="eastAsia"/>
+                <w:rFonts w:ascii="GulimChe" w:eastAsia="GulimChe" w:hAnsi="GulimChe" w:hint="eastAsia"/>
                 <w:b/>
                 <w:bCs/>
                 <w:sz w:val="22"/>
@@ -2011,7 +1657,7 @@
               <w:spacing w:line="240" w:lineRule="exact"/>
               <w:jc w:val="center"/>
               <w:rPr>
-                <w:rFonts w:ascii="굴림체" w:eastAsia="굴림체" w:hAnsi="굴림체"/>
+                <w:rFonts w:ascii="GulimChe" w:eastAsia="GulimChe" w:hAnsi="GulimChe"/>
                 <w:b/>
                 <w:bCs/>
                 <w:sz w:val="22"/>
@@ -2020,7 +1666,7 @@
             </w:pPr>
             <w:r>
               <w:rPr>
-                <w:rFonts w:ascii="굴림체" w:eastAsia="굴림체" w:hAnsi="굴림체" w:hint="eastAsia"/>
+                <w:rFonts w:ascii="GulimChe" w:eastAsia="GulimChe" w:hAnsi="GulimChe" w:hint="eastAsia"/>
                 <w:b/>
                 <w:bCs/>
                 <w:sz w:val="22"/>
@@ -2030,7 +1676,7 @@
             </w:r>
             <w:r>
               <w:rPr>
-                <w:rFonts w:ascii="굴림체" w:eastAsia="굴림체" w:hAnsi="굴림체" w:hint="eastAsia"/>
+                <w:rFonts w:ascii="GulimChe" w:eastAsia="GulimChe" w:hAnsi="GulimChe" w:hint="eastAsia"/>
                 <w:b/>
                 <w:bCs/>
                 <w:sz w:val="22"/>
@@ -2040,7 +1686,7 @@
             </w:r>
             <w:r>
               <w:rPr>
-                <w:rFonts w:ascii="굴림체" w:eastAsia="굴림체" w:hAnsi="굴림체" w:hint="eastAsia"/>
+                <w:rFonts w:ascii="GulimChe" w:eastAsia="GulimChe" w:hAnsi="GulimChe" w:hint="eastAsia"/>
                 <w:b/>
                 <w:bCs/>
                 <w:sz w:val="22"/>
@@ -2050,7 +1696,7 @@
             </w:r>
             <w:r>
               <w:rPr>
-                <w:rFonts w:ascii="굴림체" w:eastAsia="굴림체" w:hAnsi="굴림체" w:hint="eastAsia"/>
+                <w:rFonts w:ascii="GulimChe" w:eastAsia="GulimChe" w:hAnsi="GulimChe" w:hint="eastAsia"/>
                 <w:b/>
                 <w:bCs/>
                 <w:sz w:val="22"/>
@@ -2060,7 +1706,7 @@
             </w:r>
             <w:r>
               <w:rPr>
-                <w:rFonts w:ascii="굴림체" w:eastAsia="굴림체" w:hAnsi="굴림체" w:hint="eastAsia"/>
+                <w:rFonts w:ascii="GulimChe" w:eastAsia="GulimChe" w:hAnsi="GulimChe" w:hint="eastAsia"/>
                 <w:b/>
                 <w:bCs/>
                 <w:sz w:val="22"/>
@@ -2086,7 +1732,7 @@
               <w:spacing w:line="240" w:lineRule="exact"/>
               <w:jc w:val="center"/>
               <w:rPr>
-                <w:rFonts w:ascii="굴림체" w:eastAsia="굴림체" w:hAnsi="굴림체"/>
+                <w:rFonts w:ascii="GulimChe" w:eastAsia="GulimChe" w:hAnsi="GulimChe"/>
                 <w:b/>
                 <w:bCs/>
                 <w:sz w:val="22"/>
@@ -2095,7 +1741,7 @@
             </w:pPr>
             <w:r>
               <w:rPr>
-                <w:rFonts w:ascii="굴림체" w:eastAsia="굴림체" w:hAnsi="굴림체" w:hint="eastAsia"/>
+                <w:rFonts w:ascii="GulimChe" w:eastAsia="GulimChe" w:hAnsi="GulimChe" w:hint="eastAsia"/>
                 <w:b/>
                 <w:sz w:val="22"/>
                 <w:szCs w:val="22"/>
@@ -2127,19 +1773,11 @@
               <w:spacing w:line="240" w:lineRule="exact"/>
               <w:jc w:val="center"/>
               <w:rPr>
-                <w:rFonts w:ascii="굴림체" w:eastAsia="굴림체" w:hAnsi="굴림체"/>
-                <w:sz w:val="22"/>
-                <w:szCs w:val="22"/>
-              </w:rPr>
-            </w:pPr>
-            <w:r>
-              <w:rPr>
-                <w:rFonts w:ascii="굴림체" w:eastAsia="굴림체" w:hAnsi="굴림체" w:hint="eastAsia"/>
-                <w:sz w:val="22"/>
-                <w:szCs w:val="22"/>
-              </w:rPr>
-              <w:t>1</w:t>
-            </w:r>
+                <w:rFonts w:ascii="GulimChe" w:eastAsia="GulimChe" w:hAnsi="GulimChe"/>
+                <w:sz w:val="22"/>
+                <w:szCs w:val="22"/>
+              </w:rPr>
+            </w:pPr>
           </w:p>
         </w:tc>
         <w:tc>
@@ -2159,43 +1797,11 @@
               <w:spacing w:line="240" w:lineRule="exact"/>
               <w:jc w:val="center"/>
               <w:rPr>
-                <w:rFonts w:ascii="굴림체" w:eastAsia="굴림체" w:hAnsi="굴림체"/>
-                <w:sz w:val="22"/>
-                <w:szCs w:val="22"/>
-              </w:rPr>
-            </w:pPr>
-            <w:r>
-              <w:rPr>
-                <w:rFonts w:ascii="굴림체" w:eastAsia="굴림체" w:hAnsi="굴림체" w:hint="eastAsia"/>
-                <w:sz w:val="22"/>
-                <w:szCs w:val="22"/>
-              </w:rPr>
-              <w:t>S</w:t>
-            </w:r>
-            <w:r>
-              <w:rPr>
-                <w:rFonts w:ascii="굴림체" w:eastAsia="굴림체" w:hAnsi="굴림체"/>
-                <w:sz w:val="22"/>
-                <w:szCs w:val="22"/>
-              </w:rPr>
-              <w:t>UW-E</w:t>
-            </w:r>
-            <w:r>
-              <w:rPr>
-                <w:rFonts w:ascii="굴림체" w:eastAsia="굴림체" w:hAnsi="굴림체"/>
-                <w:sz w:val="22"/>
-                <w:szCs w:val="22"/>
-              </w:rPr>
-              <w:t>0</w:t>
-            </w:r>
-            <w:r>
-              <w:rPr>
-                <w:rFonts w:ascii="굴림체" w:eastAsia="굴림체" w:hAnsi="굴림체"/>
-                <w:sz w:val="22"/>
-                <w:szCs w:val="22"/>
-              </w:rPr>
-              <w:t>281</w:t>
-            </w:r>
+                <w:rFonts w:ascii="GulimChe" w:eastAsia="GulimChe" w:hAnsi="GulimChe"/>
+                <w:sz w:val="22"/>
+                <w:szCs w:val="22"/>
+              </w:rPr>
+            </w:pPr>
           </w:p>
         </w:tc>
         <w:tc>
@@ -2215,29 +1821,11 @@
               <w:spacing w:line="240" w:lineRule="exact"/>
               <w:jc w:val="center"/>
               <w:rPr>
-                <w:rFonts w:ascii="굴림체" w:eastAsia="굴림체" w:hAnsi="굴림체"/>
-                <w:sz w:val="22"/>
-                <w:szCs w:val="22"/>
-              </w:rPr>
-            </w:pPr>
-            <w:r>
-              <w:rPr>
-                <w:rFonts w:ascii="굴림체" w:eastAsia="굴림체" w:hAnsi="굴림체"/>
-              </w:rPr>
-              <w:t>NETWORK ANALYZER (N</w:t>
-            </w:r>
-            <w:r>
-              <w:rPr>
-                <w:rFonts w:ascii="굴림체" w:eastAsia="굴림체" w:hAnsi="굴림체"/>
-              </w:rPr>
-              <w:t>5225</w:t>
-            </w:r>
-            <w:r>
-              <w:rPr>
-                <w:rFonts w:ascii="굴림체" w:eastAsia="굴림체" w:hAnsi="굴림체"/>
-              </w:rPr>
-              <w:t>B)</w:t>
-            </w:r>
+                <w:rFonts w:ascii="GulimChe" w:eastAsia="GulimChe" w:hAnsi="GulimChe"/>
+                <w:sz w:val="22"/>
+                <w:szCs w:val="22"/>
+              </w:rPr>
+            </w:pPr>
           </w:p>
         </w:tc>
         <w:tc>
@@ -2256,67 +1844,11 @@
               <w:spacing w:line="240" w:lineRule="exact"/>
               <w:jc w:val="center"/>
               <w:rPr>
-                <w:rFonts w:ascii="굴림체" w:eastAsia="굴림체" w:hAnsi="굴림체"/>
-                <w:sz w:val="22"/>
-                <w:szCs w:val="22"/>
-              </w:rPr>
-            </w:pPr>
-            <w:r>
-              <w:rPr>
-                <w:rFonts w:ascii="굴림체" w:eastAsia="굴림체" w:hAnsi="굴림체" w:hint="eastAsia"/>
-                <w:sz w:val="22"/>
-                <w:szCs w:val="22"/>
-              </w:rPr>
-              <w:t>2</w:t>
-            </w:r>
-            <w:r>
-              <w:rPr>
-                <w:rFonts w:ascii="굴림체" w:eastAsia="굴림체" w:hAnsi="굴림체"/>
-                <w:sz w:val="22"/>
-                <w:szCs w:val="22"/>
-              </w:rPr>
-              <w:t>02</w:t>
-            </w:r>
-            <w:r>
-              <w:rPr>
-                <w:rFonts w:ascii="굴림체" w:eastAsia="굴림체" w:hAnsi="굴림체" w:hint="eastAsia"/>
-                <w:sz w:val="22"/>
-                <w:szCs w:val="22"/>
-              </w:rPr>
-              <w:t>5</w:t>
-            </w:r>
-            <w:r>
-              <w:rPr>
-                <w:rFonts w:ascii="굴림체" w:eastAsia="굴림체" w:hAnsi="굴림체"/>
-                <w:sz w:val="22"/>
-                <w:szCs w:val="22"/>
-              </w:rPr>
-              <w:t>-</w:t>
-            </w:r>
-            <w:r>
-              <w:rPr>
-                <w:rFonts w:ascii="굴림체" w:eastAsia="굴림체" w:hAnsi="굴림체" w:hint="eastAsia"/>
-                <w:sz w:val="22"/>
-                <w:szCs w:val="22"/>
-              </w:rPr>
-              <w:t>12</w:t>
-            </w:r>
-            <w:r>
-              <w:rPr>
-                <w:rFonts w:ascii="굴림체" w:eastAsia="굴림체" w:hAnsi="굴림체"/>
-                <w:sz w:val="22"/>
-                <w:szCs w:val="22"/>
-              </w:rPr>
-              <w:t>-</w:t>
-            </w:r>
-            <w:r>
-              <w:rPr>
-                <w:rFonts w:ascii="굴림체" w:eastAsia="굴림체" w:hAnsi="굴림체" w:hint="eastAsia"/>
-                <w:sz w:val="22"/>
-                <w:szCs w:val="22"/>
-              </w:rPr>
-              <w:t>30</w:t>
-            </w:r>
+                <w:rFonts w:ascii="GulimChe" w:eastAsia="GulimChe" w:hAnsi="GulimChe"/>
+                <w:sz w:val="22"/>
+                <w:szCs w:val="22"/>
+              </w:rPr>
+            </w:pPr>
           </w:p>
         </w:tc>
       </w:tr>
@@ -2342,7 +1874,7 @@
               <w:spacing w:line="240" w:lineRule="exact"/>
               <w:jc w:val="center"/>
               <w:rPr>
-                <w:rFonts w:ascii="굴림체" w:eastAsia="굴림체" w:hAnsi="굴림체"/>
+                <w:rFonts w:ascii="GulimChe" w:eastAsia="GulimChe" w:hAnsi="GulimChe"/>
                 <w:sz w:val="22"/>
                 <w:szCs w:val="22"/>
               </w:rPr>
@@ -2366,7 +1898,7 @@
               <w:spacing w:line="240" w:lineRule="exact"/>
               <w:jc w:val="center"/>
               <w:rPr>
-                <w:rFonts w:ascii="굴림체" w:eastAsia="굴림체" w:hAnsi="굴림체"/>
+                <w:rFonts w:ascii="GulimChe" w:eastAsia="GulimChe" w:hAnsi="GulimChe"/>
                 <w:sz w:val="22"/>
                 <w:szCs w:val="22"/>
               </w:rPr>
@@ -2390,7 +1922,7 @@
               <w:spacing w:line="240" w:lineRule="exact"/>
               <w:jc w:val="center"/>
               <w:rPr>
-                <w:rFonts w:ascii="굴림체" w:eastAsia="굴림체" w:hAnsi="굴림체"/>
+                <w:rFonts w:ascii="GulimChe" w:eastAsia="GulimChe" w:hAnsi="GulimChe"/>
                 <w:sz w:val="22"/>
                 <w:szCs w:val="22"/>
               </w:rPr>
@@ -2413,7 +1945,7 @@
               <w:spacing w:line="240" w:lineRule="exact"/>
               <w:jc w:val="center"/>
               <w:rPr>
-                <w:rFonts w:ascii="굴림체" w:eastAsia="굴림체" w:hAnsi="굴림체"/>
+                <w:rFonts w:ascii="GulimChe" w:eastAsia="GulimChe" w:hAnsi="GulimChe"/>
                 <w:sz w:val="22"/>
                 <w:szCs w:val="22"/>
               </w:rPr>
@@ -2443,7 +1975,7 @@
               <w:spacing w:line="240" w:lineRule="exact"/>
               <w:jc w:val="center"/>
               <w:rPr>
-                <w:rFonts w:ascii="굴림체" w:eastAsia="굴림체" w:hAnsi="굴림체"/>
+                <w:rFonts w:ascii="GulimChe" w:eastAsia="GulimChe" w:hAnsi="GulimChe"/>
                 <w:sz w:val="22"/>
                 <w:szCs w:val="22"/>
               </w:rPr>
@@ -2467,7 +1999,7 @@
               <w:spacing w:line="240" w:lineRule="exact"/>
               <w:jc w:val="center"/>
               <w:rPr>
-                <w:rFonts w:ascii="굴림체" w:eastAsia="굴림체" w:hAnsi="굴림체"/>
+                <w:rFonts w:ascii="GulimChe" w:eastAsia="GulimChe" w:hAnsi="GulimChe"/>
                 <w:sz w:val="22"/>
                 <w:szCs w:val="22"/>
               </w:rPr>
@@ -2491,7 +2023,7 @@
               <w:spacing w:line="240" w:lineRule="exact"/>
               <w:jc w:val="center"/>
               <w:rPr>
-                <w:rFonts w:ascii="굴림체" w:eastAsia="굴림체" w:hAnsi="굴림체"/>
+                <w:rFonts w:ascii="GulimChe" w:eastAsia="GulimChe" w:hAnsi="GulimChe"/>
                 <w:sz w:val="22"/>
                 <w:szCs w:val="22"/>
               </w:rPr>
@@ -2514,7 +2046,7 @@
               <w:spacing w:line="240" w:lineRule="exact"/>
               <w:jc w:val="center"/>
               <w:rPr>
-                <w:rFonts w:ascii="굴림체" w:eastAsia="굴림체" w:hAnsi="굴림체"/>
+                <w:rFonts w:ascii="GulimChe" w:eastAsia="GulimChe" w:hAnsi="GulimChe"/>
                 <w:sz w:val="22"/>
                 <w:szCs w:val="22"/>
               </w:rPr>
@@ -2544,7 +2076,7 @@
               <w:spacing w:line="240" w:lineRule="exact"/>
               <w:jc w:val="center"/>
               <w:rPr>
-                <w:rFonts w:ascii="굴림체" w:eastAsia="굴림체" w:hAnsi="굴림체"/>
+                <w:rFonts w:ascii="GulimChe" w:eastAsia="GulimChe" w:hAnsi="GulimChe"/>
                 <w:sz w:val="22"/>
                 <w:szCs w:val="22"/>
               </w:rPr>
@@ -2568,7 +2100,7 @@
               <w:spacing w:line="240" w:lineRule="exact"/>
               <w:jc w:val="center"/>
               <w:rPr>
-                <w:rFonts w:ascii="굴림체" w:eastAsia="굴림체" w:hAnsi="굴림체"/>
+                <w:rFonts w:ascii="GulimChe" w:eastAsia="GulimChe" w:hAnsi="GulimChe"/>
                 <w:sz w:val="22"/>
                 <w:szCs w:val="22"/>
               </w:rPr>
@@ -2592,7 +2124,7 @@
               <w:spacing w:line="240" w:lineRule="exact"/>
               <w:jc w:val="center"/>
               <w:rPr>
-                <w:rFonts w:ascii="굴림체" w:eastAsia="굴림체" w:hAnsi="굴림체"/>
+                <w:rFonts w:ascii="GulimChe" w:eastAsia="GulimChe" w:hAnsi="GulimChe"/>
                 <w:sz w:val="22"/>
                 <w:szCs w:val="22"/>
               </w:rPr>
@@ -2615,7 +2147,7 @@
               <w:spacing w:line="240" w:lineRule="exact"/>
               <w:jc w:val="center"/>
               <w:rPr>
-                <w:rFonts w:ascii="굴림체" w:eastAsia="굴림체" w:hAnsi="굴림체"/>
+                <w:rFonts w:ascii="GulimChe" w:eastAsia="GulimChe" w:hAnsi="GulimChe"/>
                 <w:sz w:val="22"/>
                 <w:szCs w:val="22"/>
               </w:rPr>
@@ -2691,7 +2223,7 @@
               <w:spacing w:line="240" w:lineRule="exact"/>
               <w:jc w:val="center"/>
               <w:rPr>
-                <w:rFonts w:ascii="굴림체" w:eastAsia="굴림체" w:hAnsi="굴림체"/>
+                <w:rFonts w:ascii="GulimChe" w:eastAsia="GulimChe" w:hAnsi="GulimChe"/>
                 <w:b/>
                 <w:bCs/>
                 <w:sz w:val="22"/>
@@ -2700,7 +2232,7 @@
             </w:pPr>
             <w:r>
               <w:rPr>
-                <w:rFonts w:ascii="굴림체" w:eastAsia="굴림체" w:hAnsi="굴림체" w:hint="eastAsia"/>
+                <w:rFonts w:ascii="GulimChe" w:eastAsia="GulimChe" w:hAnsi="GulimChe" w:hint="eastAsia"/>
                 <w:b/>
                 <w:bCs/>
                 <w:sz w:val="22"/>
@@ -2731,38 +2263,6 @@
                 <w:szCs w:val="22"/>
               </w:rPr>
             </w:pPr>
-            <w:r>
-              <w:rPr>
-                <w:rFonts w:ascii="굴림체" w:eastAsia="굴림체" w:hAnsi="굴림체" w:hint="eastAsia"/>
-                <w:sz w:val="22"/>
-                <w:szCs w:val="22"/>
-              </w:rPr>
-              <w:t>2</w:t>
-            </w:r>
-            <w:r>
-              <w:rPr>
-                <w:rFonts w:ascii="굴림체" w:eastAsia="굴림체" w:hAnsi="굴림체"/>
-                <w:sz w:val="22"/>
-                <w:szCs w:val="22"/>
-              </w:rPr>
-              <w:t>02</w:t>
-            </w:r>
-            <w:r>
-              <w:rPr>
-                <w:rFonts w:ascii="굴림체" w:eastAsia="굴림체" w:hAnsi="굴림체" w:hint="eastAsia"/>
-                <w:sz w:val="22"/>
-                <w:szCs w:val="22"/>
-              </w:rPr>
-              <w:t>6-</w:t>
-            </w:r>
-            <w:r>
-              <w:rPr>
-                <w:rFonts w:ascii="굴림체" w:eastAsia="굴림체" w:hAnsi="굴림체" w:hint="eastAsia"/>
-                <w:sz w:val="22"/>
-                <w:szCs w:val="22"/>
-              </w:rPr>
-              <w:t>01-20</w:t>
-            </w:r>
           </w:p>
         </w:tc>
         <w:tc>
@@ -2800,7 +2300,7 @@
               <w:spacing w:line="240" w:lineRule="exact"/>
               <w:jc w:val="center"/>
               <w:rPr>
-                <w:rFonts w:ascii="굴림체" w:eastAsia="굴림체" w:hAnsi="굴림체"/>
+                <w:rFonts w:ascii="GulimChe" w:eastAsia="GulimChe" w:hAnsi="GulimChe"/>
                 <w:b/>
                 <w:bCs/>
                 <w:sz w:val="22"/>
@@ -2809,7 +2309,7 @@
             </w:pPr>
             <w:r>
               <w:rPr>
-                <w:rFonts w:ascii="굴림체" w:eastAsia="굴림체" w:hAnsi="굴림체" w:hint="eastAsia"/>
+                <w:rFonts w:ascii="GulimChe" w:eastAsia="GulimChe" w:hAnsi="GulimChe" w:hint="eastAsia"/>
                 <w:b/>
                 <w:bCs/>
                 <w:sz w:val="22"/>
@@ -2825,7 +2325,7 @@
               <w:spacing w:line="240" w:lineRule="exact"/>
               <w:jc w:val="center"/>
               <w:rPr>
-                <w:rFonts w:ascii="굴림체" w:eastAsia="굴림체" w:hAnsi="굴림체"/>
+                <w:rFonts w:ascii="GulimChe" w:eastAsia="GulimChe" w:hAnsi="GulimChe"/>
                 <w:b/>
                 <w:bCs/>
                 <w:sz w:val="22"/>
@@ -2834,7 +2334,7 @@
             </w:pPr>
             <w:r>
               <w:rPr>
-                <w:rFonts w:ascii="굴림체" w:eastAsia="굴림체" w:hAnsi="굴림체" w:hint="eastAsia"/>
+                <w:rFonts w:ascii="GulimChe" w:eastAsia="GulimChe" w:hAnsi="GulimChe" w:hint="eastAsia"/>
                 <w:b/>
                 <w:bCs/>
                 <w:sz w:val="22"/>
@@ -2859,7 +2359,7 @@
               <w:spacing w:line="240" w:lineRule="exact"/>
               <w:jc w:val="center"/>
               <w:rPr>
-                <w:rFonts w:ascii="굴림체" w:eastAsia="굴림체" w:hAnsi="굴림체"/>
+                <w:rFonts w:ascii="GulimChe" w:eastAsia="GulimChe" w:hAnsi="GulimChe"/>
                 <w:b/>
                 <w:bCs/>
                 <w:sz w:val="22"/>
@@ -2868,7 +2368,7 @@
             </w:pPr>
             <w:r>
               <w:rPr>
-                <w:rFonts w:ascii="굴림체" w:eastAsia="굴림체" w:hAnsi="굴림체" w:hint="eastAsia"/>
+                <w:rFonts w:ascii="GulimChe" w:eastAsia="GulimChe" w:hAnsi="GulimChe" w:hint="eastAsia"/>
                 <w:b/>
                 <w:bCs/>
                 <w:sz w:val="22"/>
@@ -2890,7 +2390,7 @@
               <w:spacing w:line="240" w:lineRule="exact"/>
               <w:jc w:val="center"/>
               <w:rPr>
-                <w:rFonts w:ascii="굴림체" w:eastAsia="굴림체" w:hAnsi="굴림체"/>
+                <w:rFonts w:ascii="GulimChe" w:eastAsia="GulimChe" w:hAnsi="GulimChe"/>
                 <w:b/>
                 <w:bCs/>
                 <w:sz w:val="22"/>
@@ -2899,7 +2399,7 @@
             </w:pPr>
             <w:r>
               <w:rPr>
-                <w:rFonts w:ascii="굴림체" w:eastAsia="굴림체" w:hAnsi="굴림체" w:hint="eastAsia"/>
+                <w:rFonts w:ascii="GulimChe" w:eastAsia="GulimChe" w:hAnsi="GulimChe" w:hint="eastAsia"/>
                 <w:b/>
                 <w:bCs/>
                 <w:sz w:val="22"/>
@@ -2921,7 +2421,7 @@
               <w:spacing w:line="240" w:lineRule="exact"/>
               <w:jc w:val="center"/>
               <w:rPr>
-                <w:rFonts w:ascii="굴림체" w:eastAsia="굴림체" w:hAnsi="굴림체"/>
+                <w:rFonts w:ascii="GulimChe" w:eastAsia="GulimChe" w:hAnsi="GulimChe"/>
                 <w:b/>
                 <w:bCs/>
                 <w:sz w:val="22"/>
@@ -2930,7 +2430,7 @@
             </w:pPr>
             <w:r>
               <w:rPr>
-                <w:rFonts w:ascii="굴림체" w:eastAsia="굴림체" w:hAnsi="굴림체" w:hint="eastAsia"/>
+                <w:rFonts w:ascii="GulimChe" w:eastAsia="GulimChe" w:hAnsi="GulimChe" w:hint="eastAsia"/>
                 <w:b/>
                 <w:bCs/>
                 <w:sz w:val="22"/>
@@ -2961,7 +2461,7 @@
               <w:spacing w:line="240" w:lineRule="exact"/>
               <w:jc w:val="center"/>
               <w:rPr>
-                <w:rFonts w:ascii="굴림체" w:eastAsia="굴림체" w:hAnsi="굴림체"/>
+                <w:rFonts w:ascii="GulimChe" w:eastAsia="GulimChe" w:hAnsi="GulimChe"/>
                 <w:b/>
                 <w:bCs/>
                 <w:sz w:val="22"/>
@@ -2970,7 +2470,7 @@
             </w:pPr>
             <w:r>
               <w:rPr>
-                <w:rFonts w:ascii="굴림체" w:eastAsia="굴림체" w:hAnsi="굴림체" w:hint="eastAsia"/>
+                <w:rFonts w:ascii="GulimChe" w:eastAsia="GulimChe" w:hAnsi="GulimChe" w:hint="eastAsia"/>
                 <w:b/>
                 <w:bCs/>
                 <w:sz w:val="22"/>
@@ -2997,21 +2497,11 @@
               <w:spacing w:line="240" w:lineRule="exact"/>
               <w:jc w:val="center"/>
               <w:rPr>
-                <w:rFonts w:ascii="굴림체" w:eastAsia="굴림체" w:hAnsi="굴림체"/>
-                <w:sz w:val="22"/>
-                <w:szCs w:val="22"/>
-              </w:rPr>
-            </w:pPr>
-            <w:proofErr w:type="spellStart"/>
-            <w:r>
-              <w:rPr>
-                <w:rFonts w:ascii="굴림체" w:eastAsia="굴림체" w:hAnsi="굴림체" w:hint="eastAsia"/>
-                <w:sz w:val="22"/>
-                <w:szCs w:val="22"/>
-              </w:rPr>
-              <w:t>박상미</w:t>
-            </w:r>
-            <w:proofErr w:type="spellEnd"/>
+                <w:rFonts w:ascii="GulimChe" w:eastAsia="GulimChe" w:hAnsi="GulimChe"/>
+                <w:sz w:val="22"/>
+                <w:szCs w:val="22"/>
+              </w:rPr>
+            </w:pPr>
           </w:p>
         </w:tc>
         <w:tc>
@@ -3046,7 +2536,7 @@
               <w:spacing w:line="240" w:lineRule="exact"/>
               <w:jc w:val="left"/>
               <w:rPr>
-                <w:rFonts w:ascii="굴림체" w:eastAsia="굴림체" w:hAnsi="굴림체"/>
+                <w:rFonts w:ascii="GulimChe" w:eastAsia="GulimChe" w:hAnsi="GulimChe"/>
                 <w:b/>
                 <w:bCs/>
                 <w:sz w:val="22"/>
@@ -3072,7 +2562,7 @@
               <w:spacing w:line="240" w:lineRule="exact"/>
               <w:jc w:val="center"/>
               <w:rPr>
-                <w:rFonts w:ascii="굴림체" w:eastAsia="굴림체" w:hAnsi="굴림체"/>
+                <w:rFonts w:ascii="GulimChe" w:eastAsia="GulimChe" w:hAnsi="GulimChe"/>
                 <w:b/>
                 <w:bCs/>
                 <w:sz w:val="22"/>
@@ -3094,7 +2584,7 @@
               <w:spacing w:line="240" w:lineRule="exact"/>
               <w:jc w:val="center"/>
               <w:rPr>
-                <w:rFonts w:ascii="굴림체" w:eastAsia="굴림체" w:hAnsi="굴림체"/>
+                <w:rFonts w:ascii="GulimChe" w:eastAsia="GulimChe" w:hAnsi="GulimChe"/>
                 <w:b/>
                 <w:bCs/>
                 <w:sz w:val="22"/>
@@ -3116,7 +2606,7 @@
               <w:spacing w:line="240" w:lineRule="exact"/>
               <w:jc w:val="center"/>
               <w:rPr>
-                <w:rFonts w:ascii="굴림체" w:eastAsia="굴림체" w:hAnsi="굴림체"/>
+                <w:rFonts w:ascii="GulimChe" w:eastAsia="GulimChe" w:hAnsi="GulimChe"/>
                 <w:b/>
                 <w:bCs/>
                 <w:sz w:val="22"/>
@@ -3146,7 +2636,7 @@
               <w:spacing w:line="240" w:lineRule="exact"/>
               <w:jc w:val="center"/>
               <w:rPr>
-                <w:rFonts w:ascii="굴림체" w:eastAsia="굴림체" w:hAnsi="굴림체"/>
+                <w:rFonts w:ascii="GulimChe" w:eastAsia="GulimChe" w:hAnsi="GulimChe"/>
                 <w:b/>
                 <w:bCs/>
                 <w:sz w:val="22"/>
@@ -3155,7 +2645,7 @@
             </w:pPr>
             <w:r>
               <w:rPr>
-                <w:rFonts w:ascii="굴림체" w:eastAsia="굴림체" w:hAnsi="굴림체" w:hint="eastAsia"/>
+                <w:rFonts w:ascii="GulimChe" w:eastAsia="GulimChe" w:hAnsi="GulimChe" w:hint="eastAsia"/>
                 <w:b/>
                 <w:bCs/>
                 <w:sz w:val="22"/>
@@ -3165,7 +2655,7 @@
             </w:r>
             <w:r>
               <w:rPr>
-                <w:rFonts w:ascii="굴림체" w:eastAsia="굴림체" w:hAnsi="굴림체" w:hint="eastAsia"/>
+                <w:rFonts w:ascii="GulimChe" w:eastAsia="GulimChe" w:hAnsi="GulimChe" w:hint="eastAsia"/>
                 <w:b/>
                 <w:bCs/>
                 <w:sz w:val="22"/>
@@ -3175,7 +2665,7 @@
             </w:r>
             <w:r>
               <w:rPr>
-                <w:rFonts w:ascii="굴림체" w:eastAsia="굴림체" w:hAnsi="굴림체" w:hint="eastAsia"/>
+                <w:rFonts w:ascii="GulimChe" w:eastAsia="GulimChe" w:hAnsi="GulimChe" w:hint="eastAsia"/>
                 <w:b/>
                 <w:bCs/>
                 <w:sz w:val="22"/>
@@ -3307,7 +2797,7 @@
         <w:spacing w:before="0" w:line="240" w:lineRule="exact"/>
         <w:ind w:left="0" w:firstLineChars="200" w:firstLine="440"/>
         <w:rPr>
-          <w:rFonts w:ascii="굴림체" w:eastAsia="굴림체" w:hAnsi="굴림체"/>
+          <w:rFonts w:ascii="GulimChe" w:eastAsia="GulimChe" w:hAnsi="GulimChe"/>
           <w:strike/>
           <w:color w:val="auto"/>
           <w:szCs w:val="24"/>
@@ -3321,7 +2811,7 @@
         <w:spacing w:before="0" w:line="240" w:lineRule="exact"/>
         <w:ind w:left="0" w:firstLineChars="200" w:firstLine="440"/>
         <w:rPr>
-          <w:rFonts w:ascii="굴림체" w:eastAsia="굴림체" w:hAnsi="굴림체"/>
+          <w:rFonts w:ascii="GulimChe" w:eastAsia="GulimChe" w:hAnsi="GulimChe"/>
           <w:strike/>
           <w:color w:val="auto"/>
           <w:szCs w:val="24"/>
@@ -3342,12 +2832,12 @@
         </w:numPr>
         <w:ind w:leftChars="0"/>
         <w:rPr>
-          <w:rFonts w:ascii="굴림체" w:eastAsia="굴림체" w:hAnsi="굴림체"/>
+          <w:rFonts w:ascii="GulimChe" w:eastAsia="GulimChe" w:hAnsi="GulimChe"/>
         </w:rPr>
       </w:pPr>
       <w:r>
         <w:rPr>
-          <w:rFonts w:ascii="굴림체" w:eastAsia="굴림체" w:hAnsi="굴림체" w:hint="eastAsia"/>
+          <w:rFonts w:ascii="GulimChe" w:eastAsia="GulimChe" w:hAnsi="GulimChe" w:hint="eastAsia"/>
         </w:rPr>
         <w:lastRenderedPageBreak/>
         <w:t>측정 결과</w:t>
@@ -3366,59 +2856,6 @@
           <w:noProof/>
         </w:rPr>
       </w:pPr>
-      <w:r>
-        <w:rPr>
-          <w:noProof/>
-        </w:rPr>
-        <w:drawing>
-          <wp:inline distT="0" distB="0" distL="0" distR="0" wp14:anchorId="30362911" wp14:editId="5DE094EB">
-            <wp:extent cx="5727700" cy="3743960"/>
-            <wp:effectExtent l="0" t="0" r="6350" b="8890"/>
-            <wp:docPr id="1826266125" name="그림 1"/>
-            <wp:cNvGraphicFramePr>
-              <a:graphicFrameLocks xmlns:a="http://schemas.openxmlformats.org/drawingml/2006/main" noChangeAspect="1"/>
-            </wp:cNvGraphicFramePr>
-            <a:graphic xmlns:a="http://schemas.openxmlformats.org/drawingml/2006/main">
-              <a:graphicData uri="http://schemas.openxmlformats.org/drawingml/2006/picture">
-                <pic:pic xmlns:pic="http://schemas.openxmlformats.org/drawingml/2006/picture">
-                  <pic:nvPicPr>
-                    <pic:cNvPr id="0" name="Picture 2"/>
-                    <pic:cNvPicPr>
-                      <a:picLocks noChangeAspect="1" noChangeArrowheads="1"/>
-                    </pic:cNvPicPr>
-                  </pic:nvPicPr>
-                  <pic:blipFill>
-                    <a:blip r:embed="rId8">
-                      <a:extLst>
-                        <a:ext uri="{28A0092B-C50C-407E-A947-70E740481C1C}">
-                          <a14:useLocalDpi xmlns:a14="http://schemas.microsoft.com/office/drawing/2010/main" val="0"/>
-                        </a:ext>
-                      </a:extLst>
-                    </a:blip>
-                    <a:srcRect/>
-                    <a:stretch>
-                      <a:fillRect/>
-                    </a:stretch>
-                  </pic:blipFill>
-                  <pic:spPr bwMode="auto">
-                    <a:xfrm>
-                      <a:off x="0" y="0"/>
-                      <a:ext cx="5727700" cy="3743960"/>
-                    </a:xfrm>
-                    <a:prstGeom prst="rect">
-                      <a:avLst/>
-                    </a:prstGeom>
-                    <a:noFill/>
-                    <a:ln>
-                      <a:noFill/>
-                    </a:ln>
-                  </pic:spPr>
-                </pic:pic>
-              </a:graphicData>
-            </a:graphic>
-          </wp:inline>
-        </w:drawing>
-      </w:r>
     </w:p>
     <w:p/>
     <w:p>
@@ -3426,144 +2863,17 @@
         <w:pStyle w:val="aa"/>
         <w:ind w:leftChars="0" w:left="760"/>
         <w:rPr>
-          <w:rFonts w:ascii="굴림체" w:eastAsia="굴림체" w:hAnsi="굴림체"/>
+          <w:rFonts w:ascii="GulimChe" w:eastAsia="GulimChe" w:hAnsi="GulimChe"/>
         </w:rPr>
       </w:pPr>
-    </w:p>
-    <w:p>
-      <w:pPr>
-        <w:pStyle w:val="aa"/>
-        <w:numPr>
-          <w:ilvl w:val="0"/>
-          <w:numId w:val="6"/>
-        </w:numPr>
-        <w:ind w:leftChars="0"/>
-        <w:rPr>
-          <w:rFonts w:ascii="굴림체" w:eastAsia="굴림체" w:hAnsi="굴림체"/>
-        </w:rPr>
-      </w:pPr>
-      <w:bookmarkStart w:id="1" w:name="_Hlk66868670"/>
-      <w:r>
-        <w:rPr>
-          <w:rFonts w:ascii="굴림체" w:eastAsia="굴림체" w:hAnsi="굴림체" w:hint="eastAsia"/>
-        </w:rPr>
-        <w:t>C</w:t>
-      </w:r>
-      <w:r>
-        <w:rPr>
-          <w:rFonts w:ascii="굴림체" w:eastAsia="굴림체" w:hAnsi="굴림체"/>
-        </w:rPr>
-        <w:t xml:space="preserve">onnector </w:t>
-      </w:r>
-      <w:r>
-        <w:rPr>
-          <w:rFonts w:ascii="굴림체" w:eastAsia="굴림체" w:hAnsi="굴림체" w:hint="eastAsia"/>
-        </w:rPr>
-        <w:t>마모 상태 확인 완료</w:t>
-      </w:r>
-    </w:p>
-    <w:p>
-      <w:pPr>
-        <w:pStyle w:val="aa"/>
-        <w:numPr>
-          <w:ilvl w:val="0"/>
-          <w:numId w:val="6"/>
-        </w:numPr>
-        <w:ind w:leftChars="0"/>
-        <w:rPr>
-          <w:rFonts w:ascii="굴림체" w:eastAsia="굴림체" w:hAnsi="굴림체"/>
-        </w:rPr>
-      </w:pPr>
-      <w:r>
-        <w:rPr>
-          <w:rFonts w:ascii="굴림체" w:eastAsia="굴림체" w:hAnsi="굴림체" w:hint="eastAsia"/>
-        </w:rPr>
-        <w:t xml:space="preserve">특성확인 결과 </w:t>
-      </w:r>
-      <w:r>
-        <w:rPr>
-          <w:rFonts w:ascii="굴림체" w:eastAsia="굴림체" w:hAnsi="굴림체"/>
-        </w:rPr>
-        <w:t>1-18</w:t>
-      </w:r>
-      <w:r>
-        <w:rPr>
-          <w:rFonts w:ascii="굴림체" w:eastAsia="굴림체" w:hAnsi="굴림체"/>
-        </w:rPr>
-        <w:t xml:space="preserve"> </w:t>
-      </w:r>
-      <w:r>
-        <w:rPr>
-          <w:rFonts w:ascii="굴림체" w:eastAsia="굴림체" w:hAnsi="굴림체" w:hint="eastAsia"/>
-        </w:rPr>
-        <w:t>G</w:t>
-      </w:r>
-      <w:r>
-        <w:rPr>
-          <w:rFonts w:ascii="굴림체" w:eastAsia="굴림체" w:hAnsi="굴림체"/>
-        </w:rPr>
-        <w:t xml:space="preserve">Hz </w:t>
-      </w:r>
-      <w:r>
-        <w:rPr>
-          <w:rFonts w:ascii="굴림체" w:eastAsia="굴림체" w:hAnsi="굴림체" w:hint="eastAsia"/>
-        </w:rPr>
-        <w:t xml:space="preserve">대역에서 </w:t>
-      </w:r>
-      <w:r>
-        <w:rPr>
-          <w:rFonts w:ascii="굴림체" w:eastAsia="굴림체" w:hAnsi="굴림체" w:hint="eastAsia"/>
-        </w:rPr>
-        <w:t>제조사 오차 범위 이내 특성 확인함.</w:t>
-      </w:r>
-    </w:p>
-    <w:bookmarkEnd w:id="1"/>
-    <w:p>
-      <w:pPr>
-        <w:pStyle w:val="aa"/>
-        <w:ind w:leftChars="0" w:left="760"/>
-        <w:rPr>
-          <w:rFonts w:ascii="굴림체" w:eastAsia="굴림체" w:hAnsi="굴림체"/>
-        </w:rPr>
-      </w:pPr>
-      <w:r>
-        <w:rPr>
-          <w:rFonts w:ascii="굴림체" w:eastAsia="굴림체" w:hAnsi="굴림체"/>
-        </w:rPr>
-        <w:object w:dxaOrig="1520" w:dyaOrig="1061" w14:anchorId="5D0F4810">
-          <v:shapetype id="_x0000_t75" coordsize="21600,21600" o:spt="75" o:preferrelative="t" path="m@4@5l@4@11@9@11@9@5xe" filled="f" stroked="f">
-            <v:stroke joinstyle="miter"/>
-            <v:formulas>
-              <v:f eqn="if lineDrawn pixelLineWidth 0"/>
-              <v:f eqn="sum @0 1 0"/>
-              <v:f eqn="sum 0 0 @1"/>
-              <v:f eqn="prod @2 1 2"/>
-              <v:f eqn="prod @3 21600 pixelWidth"/>
-              <v:f eqn="prod @3 21600 pixelHeight"/>
-              <v:f eqn="sum @0 0 1"/>
-              <v:f eqn="prod @6 1 2"/>
-              <v:f eqn="prod @7 21600 pixelWidth"/>
-              <v:f eqn="sum @8 21600 0"/>
-              <v:f eqn="prod @7 21600 pixelHeight"/>
-              <v:f eqn="sum @10 21600 0"/>
-            </v:formulas>
-            <v:path o:extrusionok="f" gradientshapeok="t" o:connecttype="rect"/>
-            <o:lock v:ext="edit" aspectratio="t"/>
-          </v:shapetype>
-          <v:shape id="_x0000_i1025" type="#_x0000_t75" style="width:75.75pt;height:53.25pt" o:ole="">
-            <v:imagedata r:id="rId9" o:title=""/>
-          </v:shape>
-          <o:OLEObject Type="Embed" ProgID="Excel.SheetMacroEnabled.12" ShapeID="_x0000_i1025" DrawAspect="Icon" ObjectID="_1831787364" r:id="rId10"/>
-        </w:object>
-      </w:r>
     </w:p>
     <w:sectPr>
-      <w:headerReference w:type="even" r:id="rId11"/>
-      <w:headerReference w:type="default" r:id="rId12"/>
-      <w:footerReference w:type="even" r:id="rId13"/>
-      <w:footerReference w:type="default" r:id="rId14"/>
-      <w:headerReference w:type="first" r:id="rId15"/>
-      <w:footerReference w:type="first" r:id="rId16"/>
+      <w:headerReference w:type="even" r:id="rId8"/>
+      <w:headerReference w:type="default" r:id="rId9"/>
+      <w:footerReference w:type="even" r:id="rId10"/>
+      <w:footerReference w:type="default" r:id="rId11"/>
+      <w:headerReference w:type="first" r:id="rId12"/>
+      <w:footerReference w:type="first" r:id="rId13"/>
       <w:pgSz w:w="11907" w:h="16840" w:code="9"/>
       <w:pgMar w:top="1701" w:right="1440" w:bottom="1440" w:left="1440" w:header="709" w:footer="709" w:gutter="0"/>
       <w:cols w:space="708"/>
@@ -3609,7 +2919,7 @@
       <w:pStyle w:val="a5"/>
       <w:jc w:val="center"/>
       <w:rPr>
-        <w:rFonts w:ascii="굴림체" w:eastAsia="굴림체" w:hAnsi="굴림체"/>
+        <w:rFonts w:ascii="GulimChe" w:eastAsia="GulimChe" w:hAnsi="GulimChe"/>
         <w:spacing w:val="-8"/>
         <w:sz w:val="18"/>
       </w:rPr>
@@ -3619,14 +2929,14 @@
     <w:pPr>
       <w:pStyle w:val="a5"/>
       <w:rPr>
-        <w:rFonts w:ascii="굴림체" w:eastAsia="굴림체" w:hAnsi="굴림체"/>
+        <w:rFonts w:ascii="GulimChe" w:eastAsia="GulimChe" w:hAnsi="GulimChe"/>
         <w:sz w:val="18"/>
         <w:szCs w:val="18"/>
       </w:rPr>
     </w:pPr>
     <w:r>
       <w:rPr>
-        <w:rFonts w:ascii="굴림체" w:eastAsia="굴림체" w:hAnsi="굴림체"/>
+        <w:rFonts w:ascii="GulimChe" w:eastAsia="GulimChe" w:hAnsi="GulimChe"/>
         <w:noProof/>
         <w:sz w:val="18"/>
         <w:szCs w:val="18"/>
@@ -3703,7 +3013,7 @@
     <w:r>
       <w:rPr>
         <w:rStyle w:val="a8"/>
-        <w:rFonts w:ascii="굴림체" w:eastAsia="굴림체" w:hAnsi="굴림체"/>
+        <w:rFonts w:ascii="GulimChe" w:eastAsia="GulimChe" w:hAnsi="GulimChe"/>
         <w:sz w:val="18"/>
         <w:szCs w:val="18"/>
       </w:rPr>
@@ -3712,7 +3022,7 @@
     <w:r>
       <w:rPr>
         <w:rStyle w:val="a8"/>
-        <w:rFonts w:ascii="굴림체" w:eastAsia="굴림체" w:hAnsi="굴림체"/>
+        <w:rFonts w:ascii="GulimChe" w:eastAsia="GulimChe" w:hAnsi="GulimChe"/>
         <w:sz w:val="18"/>
         <w:szCs w:val="18"/>
       </w:rPr>
@@ -3721,7 +3031,7 @@
     <w:r>
       <w:rPr>
         <w:rStyle w:val="a8"/>
-        <w:rFonts w:ascii="굴림체" w:eastAsia="굴림체" w:hAnsi="굴림체" w:hint="eastAsia"/>
+        <w:rFonts w:ascii="GulimChe" w:eastAsia="GulimChe" w:hAnsi="GulimChe" w:hint="eastAsia"/>
         <w:sz w:val="18"/>
         <w:szCs w:val="18"/>
       </w:rPr>
@@ -3730,7 +3040,7 @@
     <w:r>
       <w:rPr>
         <w:rStyle w:val="a8"/>
-        <w:rFonts w:ascii="굴림체" w:eastAsia="굴림체" w:hAnsi="굴림체"/>
+        <w:rFonts w:ascii="GulimChe" w:eastAsia="GulimChe" w:hAnsi="GulimChe"/>
         <w:sz w:val="18"/>
         <w:szCs w:val="18"/>
       </w:rPr>
@@ -3739,7 +3049,7 @@
     <w:r>
       <w:rPr>
         <w:rStyle w:val="a8"/>
-        <w:rFonts w:ascii="굴림체" w:eastAsia="굴림체" w:hAnsi="굴림체" w:hint="eastAsia"/>
+        <w:rFonts w:ascii="GulimChe" w:eastAsia="GulimChe" w:hAnsi="GulimChe" w:hint="eastAsia"/>
         <w:sz w:val="18"/>
         <w:szCs w:val="18"/>
       </w:rPr>
@@ -3748,7 +3058,7 @@
     <w:r>
       <w:rPr>
         <w:rStyle w:val="a8"/>
-        <w:rFonts w:ascii="굴림체" w:eastAsia="굴림체" w:hAnsi="굴림체" w:hint="eastAsia"/>
+        <w:rFonts w:ascii="GulimChe" w:eastAsia="GulimChe" w:hAnsi="GulimChe" w:hint="eastAsia"/>
         <w:sz w:val="18"/>
         <w:szCs w:val="18"/>
       </w:rPr>
@@ -3757,7 +3067,7 @@
     <w:r>
       <w:rPr>
         <w:rStyle w:val="a8"/>
-        <w:rFonts w:ascii="굴림체" w:eastAsia="굴림체" w:hAnsi="굴림체" w:hint="eastAsia"/>
+        <w:rFonts w:ascii="GulimChe" w:eastAsia="GulimChe" w:hAnsi="GulimChe" w:hint="eastAsia"/>
         <w:sz w:val="18"/>
         <w:szCs w:val="18"/>
       </w:rPr>
@@ -3766,7 +3076,7 @@
     <w:proofErr w:type="spellStart"/>
     <w:r>
       <w:rPr>
-        <w:rFonts w:ascii="굴림체" w:eastAsia="굴림체" w:hAnsi="굴림체" w:hint="eastAsia"/>
+        <w:rFonts w:ascii="GulimChe" w:eastAsia="GulimChe" w:hAnsi="GulimChe" w:hint="eastAsia"/>
         <w:spacing w:val="-8"/>
         <w:sz w:val="18"/>
         <w:szCs w:val="18"/>
@@ -3776,7 +3086,7 @@
     <w:proofErr w:type="spellEnd"/>
     <w:r>
       <w:rPr>
-        <w:rFonts w:ascii="굴림체" w:eastAsia="굴림체" w:hAnsi="굴림체" w:hint="eastAsia"/>
+        <w:rFonts w:ascii="GulimChe" w:eastAsia="GulimChe" w:hAnsi="GulimChe" w:hint="eastAsia"/>
         <w:spacing w:val="-8"/>
         <w:sz w:val="18"/>
         <w:szCs w:val="18"/>
@@ -3836,7 +3146,7 @@
       </w:tabs>
       <w:jc w:val="center"/>
       <w:rPr>
-        <w:rFonts w:ascii="굴림" w:eastAsia="굴림"/>
+        <w:rFonts w:ascii="Gulim" w:eastAsia="Gulim"/>
         <w:bCs/>
         <w:sz w:val="30"/>
         <w:szCs w:val="30"/>
@@ -3922,7 +3232,7 @@
     </w:r>
     <w:r>
       <w:rPr>
-        <w:rFonts w:ascii="굴림체" w:eastAsia="굴림체"/>
+        <w:rFonts w:ascii="GulimChe" w:eastAsia="GulimChe"/>
         <w:bCs/>
         <w:noProof/>
         <w:sz w:val="32"/>
@@ -4032,7 +3342,7 @@
     </w:r>
     <w:r>
       <w:rPr>
-        <w:rFonts w:eastAsia="굴림체" w:hint="eastAsia"/>
+        <w:rFonts w:eastAsia="GulimChe" w:hint="eastAsia"/>
         <w:bCs/>
         <w:sz w:val="32"/>
         <w:szCs w:val="32"/>
@@ -4042,7 +3352,7 @@
     </w:r>
     <w:r>
       <w:rPr>
-        <w:rFonts w:eastAsia="굴림체" w:hint="eastAsia"/>
+        <w:rFonts w:eastAsia="GulimChe" w:hint="eastAsia"/>
         <w:bCs/>
         <w:sz w:val="32"/>
         <w:szCs w:val="32"/>
@@ -4052,7 +3362,7 @@
     </w:r>
     <w:r>
       <w:rPr>
-        <w:rFonts w:eastAsia="굴림체" w:hint="eastAsia"/>
+        <w:rFonts w:eastAsia="GulimChe" w:hint="eastAsia"/>
         <w:bCs/>
         <w:sz w:val="32"/>
         <w:szCs w:val="32"/>
@@ -4062,7 +3372,7 @@
     </w:r>
     <w:r>
       <w:rPr>
-        <w:rFonts w:eastAsia="굴림체" w:hint="eastAsia"/>
+        <w:rFonts w:eastAsia="GulimChe" w:hint="eastAsia"/>
         <w:bCs/>
         <w:sz w:val="32"/>
         <w:szCs w:val="32"/>
@@ -4072,7 +3382,7 @@
     </w:r>
     <w:r>
       <w:rPr>
-        <w:rFonts w:eastAsia="굴림체" w:hint="eastAsia"/>
+        <w:rFonts w:eastAsia="GulimChe" w:hint="eastAsia"/>
         <w:bCs/>
         <w:sz w:val="32"/>
         <w:szCs w:val="32"/>
@@ -4082,7 +3392,7 @@
     </w:r>
     <w:r>
       <w:rPr>
-        <w:rFonts w:eastAsia="굴림체" w:hint="eastAsia"/>
+        <w:rFonts w:eastAsia="GulimChe" w:hint="eastAsia"/>
         <w:bCs/>
         <w:sz w:val="32"/>
         <w:szCs w:val="32"/>
@@ -4092,7 +3402,7 @@
     </w:r>
     <w:r>
       <w:rPr>
-        <w:rFonts w:eastAsia="굴림체" w:hint="eastAsia"/>
+        <w:rFonts w:eastAsia="GulimChe" w:hint="eastAsia"/>
         <w:bCs/>
         <w:sz w:val="32"/>
         <w:szCs w:val="32"/>
@@ -4102,7 +3412,7 @@
     </w:r>
     <w:r>
       <w:rPr>
-        <w:rFonts w:eastAsia="굴림체" w:hint="eastAsia"/>
+        <w:rFonts w:eastAsia="GulimChe" w:hint="eastAsia"/>
         <w:bCs/>
         <w:sz w:val="32"/>
         <w:szCs w:val="32"/>
@@ -4112,7 +3422,7 @@
     </w:r>
     <w:r>
       <w:rPr>
-        <w:rFonts w:eastAsia="굴림체" w:hint="eastAsia"/>
+        <w:rFonts w:eastAsia="GulimChe" w:hint="eastAsia"/>
         <w:bCs/>
         <w:sz w:val="32"/>
         <w:szCs w:val="32"/>
@@ -4129,7 +3439,7 @@
       </w:tabs>
       <w:jc w:val="center"/>
       <w:rPr>
-        <w:rFonts w:ascii="굴림체" w:eastAsia="굴림체"/>
+        <w:rFonts w:ascii="GulimChe" w:eastAsia="GulimChe"/>
         <w:b/>
         <w:bCs/>
         <w:sz w:val="32"/>
@@ -4145,7 +3455,7 @@
     </w:pPr>
     <w:r>
       <w:rPr>
-        <w:rFonts w:ascii="굴림체" w:hAnsi="굴림체"/>
+        <w:rFonts w:ascii="GulimChe" w:hAnsi="GulimChe"/>
         <w:noProof/>
       </w:rPr>
       <mc:AlternateContent>
@@ -4246,7 +3556,7 @@
         <w:ind w:left="465" w:hanging="360"/>
       </w:pPr>
       <w:rPr>
-        <w:rFonts w:ascii="돋움" w:eastAsia="돋움" w:hAnsi="돋움" w:cs="바탕" w:hint="eastAsia"/>
+        <w:rFonts w:ascii="Dotum" w:eastAsia="Dotum" w:hAnsi="Dotum" w:cs="Batang" w:hint="eastAsia"/>
         <w:b w:val="0"/>
       </w:rPr>
     </w:lvl>
@@ -4360,7 +3670,7 @@
         <w:ind w:left="560" w:hanging="360"/>
       </w:pPr>
       <w:rPr>
-        <w:rFonts w:ascii="굴림체" w:eastAsia="굴림체" w:hAnsi="굴림체" w:cs="Times New Roman" w:hint="eastAsia"/>
+        <w:rFonts w:ascii="GulimChe" w:eastAsia="GulimChe" w:hAnsi="GulimChe" w:cs="Times New Roman" w:hint="eastAsia"/>
       </w:rPr>
     </w:lvl>
     <w:lvl w:ilvl="1" w:tplc="04090003" w:tentative="1">
@@ -4473,7 +3783,7 @@
         <w:ind w:left="760" w:hanging="360"/>
       </w:pPr>
       <w:rPr>
-        <w:rFonts w:ascii="바탕체" w:eastAsia="바탕체" w:hAnsi="바탕체" w:cs="Times New Roman" w:hint="eastAsia"/>
+        <w:rFonts w:ascii="BatangChe" w:eastAsia="BatangChe" w:hAnsi="BatangChe" w:cs="Times New Roman" w:hint="eastAsia"/>
       </w:rPr>
     </w:lvl>
     <w:lvl w:ilvl="1" w:tplc="04090003" w:tentative="1">
@@ -4586,7 +3896,7 @@
         <w:ind w:left="354" w:hanging="360"/>
       </w:pPr>
       <w:rPr>
-        <w:rFonts w:ascii="굴림체" w:eastAsia="굴림체" w:hAnsi="굴림체" w:cs="바탕" w:hint="eastAsia"/>
+        <w:rFonts w:ascii="GulimChe" w:eastAsia="GulimChe" w:hAnsi="GulimChe" w:cs="Batang" w:hint="eastAsia"/>
       </w:rPr>
     </w:lvl>
     <w:lvl w:ilvl="1" w:tplc="04090003" w:tentative="1">
@@ -4699,7 +4009,7 @@
         <w:ind w:left="560" w:hanging="360"/>
       </w:pPr>
       <w:rPr>
-        <w:rFonts w:ascii="굴림체" w:eastAsia="굴림체" w:hAnsi="굴림체" w:cs="바탕" w:hint="eastAsia"/>
+        <w:rFonts w:ascii="GulimChe" w:eastAsia="GulimChe" w:hAnsi="GulimChe" w:cs="Batang" w:hint="eastAsia"/>
       </w:rPr>
     </w:lvl>
     <w:lvl w:ilvl="1" w:tplc="04090003" w:tentative="1">
@@ -4812,7 +4122,7 @@
         <w:ind w:left="760" w:hanging="360"/>
       </w:pPr>
       <w:rPr>
-        <w:rFonts w:ascii="Wingdings" w:eastAsia="바탕체" w:hAnsi="Wingdings" w:cs="Times New Roman" w:hint="default"/>
+        <w:rFonts w:ascii="Wingdings" w:eastAsia="BatangChe" w:hAnsi="Wingdings" w:cs="Times New Roman" w:hint="default"/>
       </w:rPr>
     </w:lvl>
     <w:lvl w:ilvl="1" w:tplc="04090003" w:tentative="1">
@@ -5339,7 +4649,7 @@
       <w:jc w:val="both"/>
     </w:pPr>
     <w:rPr>
-      <w:rFonts w:ascii="Times New Roman" w:eastAsia="바탕체" w:hAnsi="Times New Roman" w:cs="Times New Roman"/>
+      <w:rFonts w:ascii="Times New Roman" w:eastAsia="BatangChe" w:hAnsi="Times New Roman" w:cs="Times New Roman"/>
       <w:kern w:val="2"/>
       <w:sz w:val="20"/>
       <w:szCs w:val="20"/>
@@ -5358,7 +4668,7 @@
       <w:outlineLvl w:val="0"/>
     </w:pPr>
     <w:rPr>
-      <w:rFonts w:ascii="맑은 고딕" w:eastAsia="맑은 고딕" w:hAnsi="맑은 고딕"/>
+      <w:rFonts w:ascii="Malgun Gothic" w:eastAsia="Malgun Gothic" w:hAnsi="Malgun Gothic"/>
       <w:sz w:val="28"/>
       <w:szCs w:val="28"/>
     </w:rPr>
@@ -5461,7 +4771,7 @@
       <w:jc w:val="both"/>
     </w:pPr>
     <w:rPr>
-      <w:rFonts w:ascii="바탕" w:eastAsia="바탕" w:hAnsi="Times New Roman" w:cs="바탕"/>
+      <w:rFonts w:ascii="Batang" w:eastAsia="Batang" w:hAnsi="Times New Roman" w:cs="Batang"/>
       <w:color w:val="000000"/>
     </w:rPr>
   </w:style>
@@ -5487,7 +4797,7 @@
     <w:link w:val="a4"/>
     <w:rsid w:val="00733C81"/>
     <w:rPr>
-      <w:rFonts w:ascii="Times New Roman" w:eastAsia="바탕체" w:hAnsi="Times New Roman" w:cs="Times New Roman"/>
+      <w:rFonts w:ascii="Times New Roman" w:eastAsia="BatangChe" w:hAnsi="Times New Roman" w:cs="Times New Roman"/>
       <w:kern w:val="2"/>
       <w:sz w:val="20"/>
       <w:szCs w:val="20"/>
@@ -5512,7 +4822,7 @@
     <w:link w:val="a5"/>
     <w:rsid w:val="00733C81"/>
     <w:rPr>
-      <w:rFonts w:ascii="Times New Roman" w:eastAsia="바탕체" w:hAnsi="Times New Roman" w:cs="Times New Roman"/>
+      <w:rFonts w:ascii="Times New Roman" w:eastAsia="BatangChe" w:hAnsi="Times New Roman" w:cs="Times New Roman"/>
       <w:kern w:val="2"/>
       <w:sz w:val="20"/>
       <w:szCs w:val="20"/>
@@ -5525,7 +4835,7 @@
     <w:uiPriority w:val="9"/>
     <w:rsid w:val="0075478A"/>
     <w:rPr>
-      <w:rFonts w:ascii="맑은 고딕" w:eastAsia="맑은 고딕" w:hAnsi="맑은 고딕" w:cs="Times New Roman"/>
+      <w:rFonts w:ascii="Malgun Gothic" w:eastAsia="Malgun Gothic" w:hAnsi="Malgun Gothic" w:cs="Times New Roman"/>
       <w:kern w:val="2"/>
       <w:sz w:val="28"/>
       <w:szCs w:val="28"/>
@@ -5577,7 +4887,7 @@
       <w:jc w:val="both"/>
     </w:pPr>
     <w:rPr>
-      <w:rFonts w:ascii="바탕" w:eastAsia="바탕" w:hAnsi="Times New Roman" w:cs="Times New Roman"/>
+      <w:rFonts w:ascii="Batang" w:eastAsia="Batang" w:hAnsi="Times New Roman" w:cs="Times New Roman"/>
       <w:color w:val="000000"/>
       <w:sz w:val="20"/>
       <w:szCs w:val="20"/>
@@ -5592,7 +4902,7 @@
       <w:spacing w:after="0" w:line="240" w:lineRule="auto"/>
     </w:pPr>
     <w:rPr>
-      <w:rFonts w:ascii="Times New Roman" w:eastAsia="바탕체" w:hAnsi="Times New Roman" w:cs="Times New Roman"/>
+      <w:rFonts w:ascii="Times New Roman" w:eastAsia="BatangChe" w:hAnsi="Times New Roman" w:cs="Times New Roman"/>
       <w:sz w:val="20"/>
       <w:szCs w:val="20"/>
     </w:rPr>
@@ -5660,7 +4970,7 @@
       <w:jc w:val="both"/>
     </w:pPr>
     <w:rPr>
-      <w:rFonts w:ascii="바탕" w:eastAsia="바탕" w:hAnsi="Times New Roman" w:cs="바탕"/>
+      <w:rFonts w:ascii="Batang" w:eastAsia="Batang" w:hAnsi="Times New Roman" w:cs="Batang"/>
       <w:color w:val="000000"/>
     </w:rPr>
   </w:style>
@@ -5676,7 +4986,7 @@
       <w:jc w:val="left"/>
     </w:pPr>
     <w:rPr>
-      <w:rFonts w:ascii="바탕" w:eastAsia="바탕" w:hAnsi="바탕"/>
+      <w:rFonts w:ascii="Batang" w:eastAsia="Batang" w:hAnsi="Batang"/>
       <w:kern w:val="0"/>
       <w:sz w:val="24"/>
       <w:szCs w:val="24"/>
@@ -5729,7 +5039,7 @@
       <w:jc w:val="both"/>
     </w:pPr>
     <w:rPr>
-      <w:rFonts w:ascii="바탕" w:eastAsia="바탕" w:hAnsi="Times New Roman" w:cs="바탕"/>
+      <w:rFonts w:ascii="Batang" w:eastAsia="Batang" w:hAnsi="Times New Roman" w:cs="Batang"/>
       <w:color w:val="000000"/>
     </w:rPr>
   </w:style>

</xml_diff>